<commit_message>
Restyle transactions regulation: B Nazanin font, colored tables, header and page numbers
Co-Authored-By: Claude Opus 5.5 <noreply@anthropic.com>
Claude-Session: https://claude.ai/code/session_01P5njy2pndSsBFLMsP1j6Uw
</commit_message>
<xml_diff>
--- a/آیین‌نامه معاملات بردیا تجارت ماندگار.docx
+++ b/آیین‌نامه معاملات بردیا تجارت ماندگار.docx
@@ -6,9 +6,11 @@
       <w:pPr>
         <w:pStyle w:val="Heading1"/>
         <w:bidi/>
-      </w:pPr>
-      <w:r>
-        <w:rPr>
+        <w:jc w:val="center"/>
+      </w:pPr>
+      <w:r>
+        <w:rPr>
+          <w:rFonts w:ascii="B Nazanin" w:hAnsi="B Nazanin" w:cs="B Nazanin" w:eastAsia="B Nazanin"/>
           <w:rtl/>
         </w:rPr>
         <w:t xml:space="preserve">آیین‌نامه معاملات شرکت بردیا تجارت ماندگار</w:t>
@@ -16,13 +18,35 @@
     </w:p>
     <w:p>
       <w:pPr>
-        <w:bidi/>
-      </w:pPr>
-      <w:r>
-        <w:rPr>
-          <w:rtl/>
-        </w:rPr>
-        <w:t xml:space="preserve">تاریخ تهیه: ۱۰ آبان ۱۴۰۵</w:t>
+        <w:jc w:val="center"/>
+      </w:pPr>
+      <w:r>
+        <w:rPr>
+          <w:rFonts w:ascii="B Nazanin" w:hAnsi="B Nazanin" w:cs="B Nazanin" w:eastAsia="B Nazanin"/>
+          <w:rtl/>
+          <w:sz w:val="22"/>
+          <w:szCs w:val="22"/>
+          <w:color w:val="2E7D4F"/>
+        </w:rPr>
+        <w:t>شماره ثبت ۵۸۸۵۴۲  |  شناسه ملی ۱۴۰۱۰۶۰۵۳۰۵  |  کد اقتصادی ۱۴۰۱۰۶۰۵۳۰۵</w:t>
+      </w:r>
+    </w:p>
+    <w:p>
+      <w:pPr>
+        <w:pBdr>
+          <w:bottom w:val="double" w:sz="6" w:space="8" w:color="B8860B"/>
+        </w:pBdr>
+        <w:jc w:val="center"/>
+      </w:pPr>
+      <w:r>
+        <w:rPr>
+          <w:rFonts w:ascii="B Nazanin" w:hAnsi="B Nazanin" w:cs="B Nazanin" w:eastAsia="B Nazanin"/>
+          <w:rtl/>
+          <w:sz w:val="22"/>
+          <w:szCs w:val="22"/>
+          <w:color w:val="666666"/>
+        </w:rPr>
+        <w:t>تاریخ تهیه: ۱۰ آبان ۱۴۰۵</w:t>
       </w:r>
     </w:p>
     <w:p>
@@ -32,6 +56,7 @@
       </w:pPr>
       <w:r>
         <w:rPr>
+          <w:rFonts w:ascii="B Nazanin" w:hAnsi="B Nazanin" w:cs="B Nazanin" w:eastAsia="B Nazanin"/>
           <w:rtl/>
         </w:rPr>
         <w:t xml:space="preserve">فصل اول: کلیات و تعاریف</w:t>
@@ -43,6 +68,7 @@
       </w:pPr>
       <w:r>
         <w:rPr>
+          <w:rFonts w:ascii="B Nazanin" w:hAnsi="B Nazanin" w:cs="B Nazanin" w:eastAsia="B Nazanin"/>
           <w:b/>
           <w:bCs/>
           <w:rtl/>
@@ -51,6 +77,7 @@
       </w:r>
       <w:r>
         <w:rPr>
+          <w:rFonts w:ascii="B Nazanin" w:hAnsi="B Nazanin" w:cs="B Nazanin" w:eastAsia="B Nazanin"/>
           <w:rtl/>
         </w:rPr>
         <w:t xml:space="preserve"> این آیین‌نامه برای شفافیت، صرفه اقتصادی و کنترل ریسک در همه خریدها، فروش‌ها و قراردادهای شرکت بردیا تجارت ماندگار (با مسئولیت محدود) به شماره ثبت ۵۸۸۵۴۲، شناسه ملی ۱۴۰۱۰۶۰۵۳۰۵ و کد اقتصادی ۱۴۰۱۰۶۰۵۳۰۵ تدوین شده است. شرکت خصوصی است و این آیین‌نامه مقررات داخلی آن است؛ در هر مورد که قانون آمره‌ای وجود دارد، قانون مقدم است.</w:t>
@@ -62,6 +89,7 @@
       </w:pPr>
       <w:r>
         <w:rPr>
+          <w:rFonts w:ascii="B Nazanin" w:hAnsi="B Nazanin" w:cs="B Nazanin" w:eastAsia="B Nazanin"/>
           <w:b/>
           <w:bCs/>
           <w:rtl/>
@@ -70,6 +98,7 @@
       </w:r>
       <w:r>
         <w:rPr>
+          <w:rFonts w:ascii="B Nazanin" w:hAnsi="B Nazanin" w:cs="B Nazanin" w:eastAsia="B Nazanin"/>
           <w:rtl/>
         </w:rPr>
         <w:t xml:space="preserve"> این آیین‌نامه شامل موارد زیر است:</w:t>
@@ -86,6 +115,7 @@
       </w:pPr>
       <w:r>
         <w:rPr>
+          <w:rFonts w:ascii="B Nazanin" w:hAnsi="B Nazanin" w:cs="B Nazanin" w:eastAsia="B Nazanin"/>
           <w:rtl/>
         </w:rPr>
         <w:t xml:space="preserve">خرید خارجی برنج و اقلام مرتبط (کیسه، بسته‌بندی، خدمات حمل، بیمه، بازرسی، ترخیص)</w:t>
@@ -102,6 +132,7 @@
       </w:pPr>
       <w:r>
         <w:rPr>
+          <w:rFonts w:ascii="B Nazanin" w:hAnsi="B Nazanin" w:cs="B Nazanin" w:eastAsia="B Nazanin"/>
           <w:rtl/>
         </w:rPr>
         <w:t xml:space="preserve">خرید داخلی کالا و خدمات (اجاره انبار، حمل داخلی، تجهیزات، خدمات مشاوره)</w:t>
@@ -118,6 +149,7 @@
       </w:pPr>
       <w:r>
         <w:rPr>
+          <w:rFonts w:ascii="B Nazanin" w:hAnsi="B Nazanin" w:cs="B Nazanin" w:eastAsia="B Nazanin"/>
           <w:rtl/>
         </w:rPr>
         <w:t xml:space="preserve">فروش برنج به عمده‌فروشان، فروشگاه‌های زنجیره‌ای، صنایع و نمایندگان</w:t>
@@ -134,6 +166,7 @@
       </w:pPr>
       <w:r>
         <w:rPr>
+          <w:rFonts w:ascii="B Nazanin" w:hAnsi="B Nazanin" w:cs="B Nazanin" w:eastAsia="B Nazanin"/>
           <w:rtl/>
         </w:rPr>
         <w:t xml:space="preserve">فروش اموال مازاد و ضایعات</w:t>
@@ -145,6 +178,7 @@
       </w:pPr>
       <w:r>
         <w:rPr>
+          <w:rFonts w:ascii="B Nazanin" w:hAnsi="B Nazanin" w:cs="B Nazanin" w:eastAsia="B Nazanin"/>
           <w:b/>
           <w:bCs/>
           <w:rtl/>
@@ -154,11 +188,25 @@
     </w:p>
     <w:tbl>
       <w:tblPr>
-        <w:bidiVisual/>
         <w:tblStyle w:val="TableGrid"/>
         <w:tblW w:w="0" w:type="auto"/>
+        <w:jc w:val="center"/>
         <w:tblLayout w:type="fixed"/>
         <w:tblLook w:val="04A0" w:firstRow="1" w:lastRow="0" w:firstColumn="0" w:lastColumn="0" w:noHBand="0" w:noVBand="1"/>
+        <w:tblBorders>
+          <w:top w:val="single" w:sz="4" w:space="0" w:color="A9CBB4"/>
+          <w:left w:val="single" w:sz="4" w:space="0" w:color="A9CBB4"/>
+          <w:bottom w:val="single" w:sz="4" w:space="0" w:color="A9CBB4"/>
+          <w:right w:val="single" w:sz="4" w:space="0" w:color="A9CBB4"/>
+          <w:insideH w:val="single" w:sz="4" w:space="0" w:color="A9CBB4"/>
+          <w:insideV w:val="single" w:sz="4" w:space="0" w:color="A9CBB4"/>
+        </w:tblBorders>
+        <w:tblCellMar>
+          <w:top w:w="60" w:type="dxa"/>
+          <w:bottom w:w="60" w:type="dxa"/>
+          <w:left w:w="110" w:type="dxa"/>
+          <w:right w:w="110" w:type="dxa"/>
+        </w:tblCellMar>
       </w:tblPr>
       <w:tblGrid>
         <w:gridCol w:w="3822"/>
@@ -171,15 +219,21 @@
         <w:tc>
           <w:tcPr>
             <w:tcW w:w="3822" w:type="dxa"/>
-            <w:shd w:val="clear" w:color="auto" w:fill="F2F2F2"/>
-          </w:tcPr>
-          <w:p>
-            <w:pPr>
-              <w:bidi/>
-            </w:pPr>
-            <w:r>
-              <w:rPr>
-                <w:rtl/>
+            <w:shd w:val="clear" w:color="auto" w:fill="1F5132"/>
+          </w:tcPr>
+          <w:p>
+            <w:pPr>
+              <w:bidi/>
+              <w:spacing w:after="40" w:line="264" w:lineRule="auto"/>
+            </w:pPr>
+            <w:r>
+              <w:rPr>
+                <w:rFonts w:ascii="B Nazanin" w:hAnsi="B Nazanin" w:cs="B Nazanin" w:eastAsia="B Nazanin"/>
+                <w:rtl/>
+                <w:sz w:val="24"/>
+                <w:szCs w:val="24"/>
+                <w:b/>
+                <w:color w:val="FFFFFF"/>
               </w:rPr>
               <w:t xml:space="preserve">اصطلاح</w:t>
             </w:r>
@@ -188,15 +242,21 @@
         <w:tc>
           <w:tcPr>
             <w:tcW w:w="5537" w:type="dxa"/>
-            <w:shd w:val="clear" w:color="auto" w:fill="F2F2F2"/>
-          </w:tcPr>
-          <w:p>
-            <w:pPr>
-              <w:bidi/>
-            </w:pPr>
-            <w:r>
-              <w:rPr>
-                <w:rtl/>
+            <w:shd w:val="clear" w:color="auto" w:fill="1F5132"/>
+          </w:tcPr>
+          <w:p>
+            <w:pPr>
+              <w:bidi/>
+              <w:spacing w:after="40" w:line="264" w:lineRule="auto"/>
+            </w:pPr>
+            <w:r>
+              <w:rPr>
+                <w:rFonts w:ascii="B Nazanin" w:hAnsi="B Nazanin" w:cs="B Nazanin" w:eastAsia="B Nazanin"/>
+                <w:rtl/>
+                <w:sz w:val="24"/>
+                <w:szCs w:val="24"/>
+                <w:b/>
+                <w:color w:val="FFFFFF"/>
               </w:rPr>
               <w:t xml:space="preserve">معنی در این آیین‌نامه</w:t>
             </w:r>
@@ -207,14 +267,19 @@
         <w:tc>
           <w:tcPr>
             <w:tcW w:w="3822" w:type="dxa"/>
-          </w:tcPr>
-          <w:p>
-            <w:pPr>
-              <w:bidi/>
-            </w:pPr>
-            <w:r>
-              <w:rPr>
-                <w:rtl/>
+            <w:shd w:val="clear" w:color="auto" w:fill="FFFFFF"/>
+          </w:tcPr>
+          <w:p>
+            <w:pPr>
+              <w:bidi/>
+              <w:spacing w:after="40" w:line="264" w:lineRule="auto"/>
+            </w:pPr>
+            <w:r>
+              <w:rPr>
+                <w:rFonts w:ascii="B Nazanin" w:hAnsi="B Nazanin" w:cs="B Nazanin" w:eastAsia="B Nazanin"/>
+                <w:rtl/>
+                <w:sz w:val="24"/>
+                <w:szCs w:val="24"/>
               </w:rPr>
               <w:t xml:space="preserve">شرکت</w:t>
             </w:r>
@@ -223,14 +288,19 @@
         <w:tc>
           <w:tcPr>
             <w:tcW w:w="5537" w:type="dxa"/>
-          </w:tcPr>
-          <w:p>
-            <w:pPr>
-              <w:bidi/>
-            </w:pPr>
-            <w:r>
-              <w:rPr>
-                <w:rtl/>
+            <w:shd w:val="clear" w:color="auto" w:fill="FFFFFF"/>
+          </w:tcPr>
+          <w:p>
+            <w:pPr>
+              <w:bidi/>
+              <w:spacing w:after="40" w:line="264" w:lineRule="auto"/>
+            </w:pPr>
+            <w:r>
+              <w:rPr>
+                <w:rFonts w:ascii="B Nazanin" w:hAnsi="B Nazanin" w:cs="B Nazanin" w:eastAsia="B Nazanin"/>
+                <w:rtl/>
+                <w:sz w:val="24"/>
+                <w:szCs w:val="24"/>
               </w:rPr>
               <w:t xml:space="preserve">شرکت بردیا تجارت ماندگار</w:t>
             </w:r>
@@ -241,14 +311,19 @@
         <w:tc>
           <w:tcPr>
             <w:tcW w:w="3822" w:type="dxa"/>
-          </w:tcPr>
-          <w:p>
-            <w:pPr>
-              <w:bidi/>
-            </w:pPr>
-            <w:r>
-              <w:rPr>
-                <w:rtl/>
+            <w:shd w:val="clear" w:color="auto" w:fill="EEF6F0"/>
+          </w:tcPr>
+          <w:p>
+            <w:pPr>
+              <w:bidi/>
+              <w:spacing w:after="40" w:line="264" w:lineRule="auto"/>
+            </w:pPr>
+            <w:r>
+              <w:rPr>
+                <w:rFonts w:ascii="B Nazanin" w:hAnsi="B Nazanin" w:cs="B Nazanin" w:eastAsia="B Nazanin"/>
+                <w:rtl/>
+                <w:sz w:val="24"/>
+                <w:szCs w:val="24"/>
               </w:rPr>
               <w:t xml:space="preserve">هیئت‌مدیران</w:t>
             </w:r>
@@ -257,14 +332,19 @@
         <w:tc>
           <w:tcPr>
             <w:tcW w:w="5537" w:type="dxa"/>
-          </w:tcPr>
-          <w:p>
-            <w:pPr>
-              <w:bidi/>
-            </w:pPr>
-            <w:r>
-              <w:rPr>
-                <w:rtl/>
+            <w:shd w:val="clear" w:color="auto" w:fill="EEF6F0"/>
+          </w:tcPr>
+          <w:p>
+            <w:pPr>
+              <w:bidi/>
+              <w:spacing w:after="40" w:line="264" w:lineRule="auto"/>
+            </w:pPr>
+            <w:r>
+              <w:rPr>
+                <w:rFonts w:ascii="B Nazanin" w:hAnsi="B Nazanin" w:cs="B Nazanin" w:eastAsia="B Nazanin"/>
+                <w:rtl/>
+                <w:sz w:val="24"/>
+                <w:szCs w:val="24"/>
               </w:rPr>
               <w:t xml:space="preserve">مدیران شرکت که مجمع عمومی شرکا طبق اساسنامه انتخاب می‌کند</w:t>
             </w:r>
@@ -275,14 +355,19 @@
         <w:tc>
           <w:tcPr>
             <w:tcW w:w="3822" w:type="dxa"/>
-          </w:tcPr>
-          <w:p>
-            <w:pPr>
-              <w:bidi/>
-            </w:pPr>
-            <w:r>
-              <w:rPr>
-                <w:rtl/>
+            <w:shd w:val="clear" w:color="auto" w:fill="FFFFFF"/>
+          </w:tcPr>
+          <w:p>
+            <w:pPr>
+              <w:bidi/>
+              <w:spacing w:after="40" w:line="264" w:lineRule="auto"/>
+            </w:pPr>
+            <w:r>
+              <w:rPr>
+                <w:rFonts w:ascii="B Nazanin" w:hAnsi="B Nazanin" w:cs="B Nazanin" w:eastAsia="B Nazanin"/>
+                <w:rtl/>
+                <w:sz w:val="24"/>
+                <w:szCs w:val="24"/>
               </w:rPr>
               <w:t xml:space="preserve">مدیرعامل</w:t>
             </w:r>
@@ -291,14 +376,19 @@
         <w:tc>
           <w:tcPr>
             <w:tcW w:w="5537" w:type="dxa"/>
-          </w:tcPr>
-          <w:p>
-            <w:pPr>
-              <w:bidi/>
-            </w:pPr>
-            <w:r>
-              <w:rPr>
-                <w:rtl/>
+            <w:shd w:val="clear" w:color="auto" w:fill="FFFFFF"/>
+          </w:tcPr>
+          <w:p>
+            <w:pPr>
+              <w:bidi/>
+              <w:spacing w:after="40" w:line="264" w:lineRule="auto"/>
+            </w:pPr>
+            <w:r>
+              <w:rPr>
+                <w:rFonts w:ascii="B Nazanin" w:hAnsi="B Nazanin" w:cs="B Nazanin" w:eastAsia="B Nazanin"/>
+                <w:rtl/>
+                <w:sz w:val="24"/>
+                <w:szCs w:val="24"/>
               </w:rPr>
               <w:t xml:space="preserve">مدیرعامل شرکت یا قائم‌مقام قانونی او</w:t>
             </w:r>
@@ -309,14 +399,19 @@
         <w:tc>
           <w:tcPr>
             <w:tcW w:w="3822" w:type="dxa"/>
-          </w:tcPr>
-          <w:p>
-            <w:pPr>
-              <w:bidi/>
-            </w:pPr>
-            <w:r>
-              <w:rPr>
-                <w:rtl/>
+            <w:shd w:val="clear" w:color="auto" w:fill="EEF6F0"/>
+          </w:tcPr>
+          <w:p>
+            <w:pPr>
+              <w:bidi/>
+              <w:spacing w:after="40" w:line="264" w:lineRule="auto"/>
+            </w:pPr>
+            <w:r>
+              <w:rPr>
+                <w:rFonts w:ascii="B Nazanin" w:hAnsi="B Nazanin" w:cs="B Nazanin" w:eastAsia="B Nazanin"/>
+                <w:rtl/>
+                <w:sz w:val="24"/>
+                <w:szCs w:val="24"/>
               </w:rPr>
               <w:t xml:space="preserve">کمیسیون معاملات</w:t>
             </w:r>
@@ -325,14 +420,19 @@
         <w:tc>
           <w:tcPr>
             <w:tcW w:w="5537" w:type="dxa"/>
-          </w:tcPr>
-          <w:p>
-            <w:pPr>
-              <w:bidi/>
-            </w:pPr>
-            <w:r>
-              <w:rPr>
-                <w:rtl/>
+            <w:shd w:val="clear" w:color="auto" w:fill="EEF6F0"/>
+          </w:tcPr>
+          <w:p>
+            <w:pPr>
+              <w:bidi/>
+              <w:spacing w:after="40" w:line="264" w:lineRule="auto"/>
+            </w:pPr>
+            <w:r>
+              <w:rPr>
+                <w:rFonts w:ascii="B Nazanin" w:hAnsi="B Nazanin" w:cs="B Nazanin" w:eastAsia="B Nazanin"/>
+                <w:rtl/>
+                <w:sz w:val="24"/>
+                <w:szCs w:val="24"/>
               </w:rPr>
               <w:t xml:space="preserve">کمیسیون موضوع ماده ۷</w:t>
             </w:r>
@@ -343,14 +443,19 @@
         <w:tc>
           <w:tcPr>
             <w:tcW w:w="3822" w:type="dxa"/>
-          </w:tcPr>
-          <w:p>
-            <w:pPr>
-              <w:bidi/>
-            </w:pPr>
-            <w:r>
-              <w:rPr>
-                <w:rtl/>
+            <w:shd w:val="clear" w:color="auto" w:fill="FFFFFF"/>
+          </w:tcPr>
+          <w:p>
+            <w:pPr>
+              <w:bidi/>
+              <w:spacing w:after="40" w:line="264" w:lineRule="auto"/>
+            </w:pPr>
+            <w:r>
+              <w:rPr>
+                <w:rFonts w:ascii="B Nazanin" w:hAnsi="B Nazanin" w:cs="B Nazanin" w:eastAsia="B Nazanin"/>
+                <w:rtl/>
+                <w:sz w:val="24"/>
+                <w:szCs w:val="24"/>
               </w:rPr>
               <w:t xml:space="preserve">واحد بازرگانی</w:t>
             </w:r>
@@ -359,14 +464,19 @@
         <w:tc>
           <w:tcPr>
             <w:tcW w:w="5537" w:type="dxa"/>
-          </w:tcPr>
-          <w:p>
-            <w:pPr>
-              <w:bidi/>
-            </w:pPr>
-            <w:r>
-              <w:rPr>
-                <w:rtl/>
+            <w:shd w:val="clear" w:color="auto" w:fill="FFFFFF"/>
+          </w:tcPr>
+          <w:p>
+            <w:pPr>
+              <w:bidi/>
+              <w:spacing w:after="40" w:line="264" w:lineRule="auto"/>
+            </w:pPr>
+            <w:r>
+              <w:rPr>
+                <w:rFonts w:ascii="B Nazanin" w:hAnsi="B Nazanin" w:cs="B Nazanin" w:eastAsia="B Nazanin"/>
+                <w:rtl/>
+                <w:sz w:val="24"/>
+                <w:szCs w:val="24"/>
               </w:rPr>
               <w:t xml:space="preserve">واحد مسئول خرید خارجی، تأمین و فروش</w:t>
             </w:r>
@@ -377,14 +487,19 @@
         <w:tc>
           <w:tcPr>
             <w:tcW w:w="3822" w:type="dxa"/>
-          </w:tcPr>
-          <w:p>
-            <w:pPr>
-              <w:bidi/>
-            </w:pPr>
-            <w:r>
-              <w:rPr>
-                <w:rtl/>
+            <w:shd w:val="clear" w:color="auto" w:fill="EEF6F0"/>
+          </w:tcPr>
+          <w:p>
+            <w:pPr>
+              <w:bidi/>
+              <w:spacing w:after="40" w:line="264" w:lineRule="auto"/>
+            </w:pPr>
+            <w:r>
+              <w:rPr>
+                <w:rFonts w:ascii="B Nazanin" w:hAnsi="B Nazanin" w:cs="B Nazanin" w:eastAsia="B Nazanin"/>
+                <w:rtl/>
+                <w:sz w:val="24"/>
+                <w:szCs w:val="24"/>
               </w:rPr>
               <w:t xml:space="preserve">تأمین‌کننده</w:t>
             </w:r>
@@ -393,14 +508,19 @@
         <w:tc>
           <w:tcPr>
             <w:tcW w:w="5537" w:type="dxa"/>
-          </w:tcPr>
-          <w:p>
-            <w:pPr>
-              <w:bidi/>
-            </w:pPr>
-            <w:r>
-              <w:rPr>
-                <w:rtl/>
+            <w:shd w:val="clear" w:color="auto" w:fill="EEF6F0"/>
+          </w:tcPr>
+          <w:p>
+            <w:pPr>
+              <w:bidi/>
+              <w:spacing w:after="40" w:line="264" w:lineRule="auto"/>
+            </w:pPr>
+            <w:r>
+              <w:rPr>
+                <w:rFonts w:ascii="B Nazanin" w:hAnsi="B Nazanin" w:cs="B Nazanin" w:eastAsia="B Nazanin"/>
+                <w:rtl/>
+                <w:sz w:val="24"/>
+                <w:szCs w:val="24"/>
               </w:rPr>
               <w:t xml:space="preserve">فروشنده خارجی یا داخلی کالا یا خدمت</w:t>
             </w:r>
@@ -411,14 +531,19 @@
         <w:tc>
           <w:tcPr>
             <w:tcW w:w="3822" w:type="dxa"/>
-          </w:tcPr>
-          <w:p>
-            <w:pPr>
-              <w:bidi/>
-            </w:pPr>
-            <w:r>
-              <w:rPr>
-                <w:rtl/>
+            <w:shd w:val="clear" w:color="auto" w:fill="FFFFFF"/>
+          </w:tcPr>
+          <w:p>
+            <w:pPr>
+              <w:bidi/>
+              <w:spacing w:after="40" w:line="264" w:lineRule="auto"/>
+            </w:pPr>
+            <w:r>
+              <w:rPr>
+                <w:rFonts w:ascii="B Nazanin" w:hAnsi="B Nazanin" w:cs="B Nazanin" w:eastAsia="B Nazanin"/>
+                <w:rtl/>
+                <w:sz w:val="24"/>
+                <w:szCs w:val="24"/>
               </w:rPr>
               <w:t xml:space="preserve">مبلغ معامله</w:t>
             </w:r>
@@ -427,14 +552,19 @@
         <w:tc>
           <w:tcPr>
             <w:tcW w:w="5537" w:type="dxa"/>
-          </w:tcPr>
-          <w:p>
-            <w:pPr>
-              <w:bidi/>
-            </w:pPr>
-            <w:r>
-              <w:rPr>
-                <w:rtl/>
+            <w:shd w:val="clear" w:color="auto" w:fill="FFFFFF"/>
+          </w:tcPr>
+          <w:p>
+            <w:pPr>
+              <w:bidi/>
+              <w:spacing w:after="40" w:line="264" w:lineRule="auto"/>
+            </w:pPr>
+            <w:r>
+              <w:rPr>
+                <w:rFonts w:ascii="B Nazanin" w:hAnsi="B Nazanin" w:cs="B Nazanin" w:eastAsia="B Nazanin"/>
+                <w:rtl/>
+                <w:sz w:val="24"/>
+                <w:szCs w:val="24"/>
               </w:rPr>
               <w:t xml:space="preserve">کل مبلغ قرارداد با احتساب همه هزینه‌ها، به ریال، با نرخ ارز روز تصویب برای معاملات ارزی</w:t>
             </w:r>
@@ -445,14 +575,19 @@
         <w:tc>
           <w:tcPr>
             <w:tcW w:w="3822" w:type="dxa"/>
-          </w:tcPr>
-          <w:p>
-            <w:pPr>
-              <w:bidi/>
-            </w:pPr>
-            <w:r>
-              <w:rPr>
-                <w:rtl/>
+            <w:shd w:val="clear" w:color="auto" w:fill="EEF6F0"/>
+          </w:tcPr>
+          <w:p>
+            <w:pPr>
+              <w:bidi/>
+              <w:spacing w:after="40" w:line="264" w:lineRule="auto"/>
+            </w:pPr>
+            <w:r>
+              <w:rPr>
+                <w:rFonts w:ascii="B Nazanin" w:hAnsi="B Nazanin" w:cs="B Nazanin" w:eastAsia="B Nazanin"/>
+                <w:rtl/>
+                <w:sz w:val="24"/>
+                <w:szCs w:val="24"/>
               </w:rPr>
               <w:t xml:space="preserve">نصاب</w:t>
             </w:r>
@@ -461,14 +596,19 @@
         <w:tc>
           <w:tcPr>
             <w:tcW w:w="5537" w:type="dxa"/>
-          </w:tcPr>
-          <w:p>
-            <w:pPr>
-              <w:bidi/>
-            </w:pPr>
-            <w:r>
-              <w:rPr>
-                <w:rtl/>
+            <w:shd w:val="clear" w:color="auto" w:fill="EEF6F0"/>
+          </w:tcPr>
+          <w:p>
+            <w:pPr>
+              <w:bidi/>
+              <w:spacing w:after="40" w:line="264" w:lineRule="auto"/>
+            </w:pPr>
+            <w:r>
+              <w:rPr>
+                <w:rFonts w:ascii="B Nazanin" w:hAnsi="B Nazanin" w:cs="B Nazanin" w:eastAsia="B Nazanin"/>
+                <w:rtl/>
+                <w:sz w:val="24"/>
+                <w:szCs w:val="24"/>
               </w:rPr>
               <w:t xml:space="preserve">سقف مبلغی هر طبقه معامله طبق ماده ۵</w:t>
             </w:r>
@@ -479,14 +619,19 @@
         <w:tc>
           <w:tcPr>
             <w:tcW w:w="3822" w:type="dxa"/>
-          </w:tcPr>
-          <w:p>
-            <w:pPr>
-              <w:bidi/>
-            </w:pPr>
-            <w:r>
-              <w:rPr>
-                <w:rtl/>
+            <w:shd w:val="clear" w:color="auto" w:fill="FFFFFF"/>
+          </w:tcPr>
+          <w:p>
+            <w:pPr>
+              <w:bidi/>
+              <w:spacing w:after="40" w:line="264" w:lineRule="auto"/>
+            </w:pPr>
+            <w:r>
+              <w:rPr>
+                <w:rFonts w:ascii="B Nazanin" w:hAnsi="B Nazanin" w:cs="B Nazanin" w:eastAsia="B Nazanin"/>
+                <w:rtl/>
+                <w:sz w:val="24"/>
+                <w:szCs w:val="24"/>
               </w:rPr>
               <w:t xml:space="preserve">اینکوترمز</w:t>
             </w:r>
@@ -495,14 +640,19 @@
         <w:tc>
           <w:tcPr>
             <w:tcW w:w="5537" w:type="dxa"/>
-          </w:tcPr>
-          <w:p>
-            <w:pPr>
-              <w:bidi/>
-            </w:pPr>
-            <w:r>
-              <w:rPr>
-                <w:rtl/>
+            <w:shd w:val="clear" w:color="auto" w:fill="FFFFFF"/>
+          </w:tcPr>
+          <w:p>
+            <w:pPr>
+              <w:bidi/>
+              <w:spacing w:after="40" w:line="264" w:lineRule="auto"/>
+            </w:pPr>
+            <w:r>
+              <w:rPr>
+                <w:rFonts w:ascii="B Nazanin" w:hAnsi="B Nazanin" w:cs="B Nazanin" w:eastAsia="B Nazanin"/>
+                <w:rtl/>
+                <w:sz w:val="24"/>
+                <w:szCs w:val="24"/>
               </w:rPr>
               <w:t xml:space="preserve">قواعد Incoterms 2020 اتاق بازرگانی بین‌المللی (مثل FOB، CFR، CIF)</w:t>
             </w:r>
@@ -516,6 +666,7 @@
       </w:pPr>
       <w:r>
         <w:rPr>
+          <w:rFonts w:ascii="B Nazanin" w:hAnsi="B Nazanin" w:cs="B Nazanin" w:eastAsia="B Nazanin"/>
           <w:b/>
           <w:bCs/>
           <w:rtl/>
@@ -524,6 +675,7 @@
       </w:r>
       <w:r>
         <w:rPr>
+          <w:rFonts w:ascii="B Nazanin" w:hAnsi="B Nazanin" w:cs="B Nazanin" w:eastAsia="B Nazanin"/>
           <w:rtl/>
         </w:rPr>
         <w:t xml:space="preserve"> تقسیم یک معامله به چند معامله کوچک‌تر برای پایین آوردن نصاب ممنوع است. معاملات هم‌جنس یک تأمین‌کننده در یک دوره سه‌ماهه، یک معامله حساب می‌شوند.</w:t>
@@ -536,6 +688,7 @@
       </w:pPr>
       <w:r>
         <w:rPr>
+          <w:rFonts w:ascii="B Nazanin" w:hAnsi="B Nazanin" w:cs="B Nazanin" w:eastAsia="B Nazanin"/>
           <w:rtl/>
         </w:rPr>
         <w:t xml:space="preserve">فصل دوم: طبقه‌بندی معاملات</w:t>
@@ -547,6 +700,7 @@
       </w:pPr>
       <w:r>
         <w:rPr>
+          <w:rFonts w:ascii="B Nazanin" w:hAnsi="B Nazanin" w:cs="B Nazanin" w:eastAsia="B Nazanin"/>
           <w:b/>
           <w:bCs/>
           <w:rtl/>
@@ -555,6 +709,7 @@
       </w:r>
       <w:r>
         <w:rPr>
+          <w:rFonts w:ascii="B Nazanin" w:hAnsi="B Nazanin" w:cs="B Nazanin" w:eastAsia="B Nazanin"/>
           <w:rtl/>
         </w:rPr>
         <w:t xml:space="preserve"> معاملات به سه طبقه تقسیم می‌شوند. ارقام زیر پیشنهادی است و هیئت‌مدیران آن‌ها را هر سال با توجه به تورم و حجم کسب‌وکار بازبینی می‌کند.</w:t>
@@ -562,11 +717,25 @@
     </w:p>
     <w:tbl>
       <w:tblPr>
-        <w:bidiVisual/>
         <w:tblStyle w:val="TableGrid"/>
         <w:tblW w:w="0" w:type="auto"/>
+        <w:jc w:val="center"/>
         <w:tblLayout w:type="fixed"/>
         <w:tblLook w:val="04A0" w:firstRow="1" w:lastRow="0" w:firstColumn="0" w:lastColumn="0" w:noHBand="0" w:noVBand="1"/>
+        <w:tblBorders>
+          <w:top w:val="single" w:sz="4" w:space="0" w:color="A9CBB4"/>
+          <w:left w:val="single" w:sz="4" w:space="0" w:color="A9CBB4"/>
+          <w:bottom w:val="single" w:sz="4" w:space="0" w:color="A9CBB4"/>
+          <w:right w:val="single" w:sz="4" w:space="0" w:color="A9CBB4"/>
+          <w:insideH w:val="single" w:sz="4" w:space="0" w:color="A9CBB4"/>
+          <w:insideV w:val="single" w:sz="4" w:space="0" w:color="A9CBB4"/>
+        </w:tblBorders>
+        <w:tblCellMar>
+          <w:top w:w="60" w:type="dxa"/>
+          <w:bottom w:w="60" w:type="dxa"/>
+          <w:left w:w="110" w:type="dxa"/>
+          <w:right w:w="110" w:type="dxa"/>
+        </w:tblCellMar>
       </w:tblPr>
       <w:tblGrid>
         <w:gridCol w:w="2076"/>
@@ -581,15 +750,21 @@
         <w:tc>
           <w:tcPr>
             <w:tcW w:w="2076" w:type="dxa"/>
-            <w:shd w:val="clear" w:color="auto" w:fill="F2F2F2"/>
-          </w:tcPr>
-          <w:p>
-            <w:pPr>
-              <w:bidi/>
-            </w:pPr>
-            <w:r>
-              <w:rPr>
-                <w:rtl/>
+            <w:shd w:val="clear" w:color="auto" w:fill="1F5132"/>
+          </w:tcPr>
+          <w:p>
+            <w:pPr>
+              <w:bidi/>
+              <w:spacing w:after="40" w:line="264" w:lineRule="auto"/>
+            </w:pPr>
+            <w:r>
+              <w:rPr>
+                <w:rFonts w:ascii="B Nazanin" w:hAnsi="B Nazanin" w:cs="B Nazanin" w:eastAsia="B Nazanin"/>
+                <w:rtl/>
+                <w:sz w:val="24"/>
+                <w:szCs w:val="24"/>
+                <w:b/>
+                <w:color w:val="FFFFFF"/>
               </w:rPr>
               <w:t xml:space="preserve">طبقه</w:t>
             </w:r>
@@ -598,15 +773,21 @@
         <w:tc>
           <w:tcPr>
             <w:tcW w:w="1873" w:type="dxa"/>
-            <w:shd w:val="clear" w:color="auto" w:fill="F2F2F2"/>
-          </w:tcPr>
-          <w:p>
-            <w:pPr>
-              <w:bidi/>
-            </w:pPr>
-            <w:r>
-              <w:rPr>
-                <w:rtl/>
+            <w:shd w:val="clear" w:color="auto" w:fill="1F5132"/>
+          </w:tcPr>
+          <w:p>
+            <w:pPr>
+              <w:bidi/>
+              <w:spacing w:after="40" w:line="264" w:lineRule="auto"/>
+            </w:pPr>
+            <w:r>
+              <w:rPr>
+                <w:rFonts w:ascii="B Nazanin" w:hAnsi="B Nazanin" w:cs="B Nazanin" w:eastAsia="B Nazanin"/>
+                <w:rtl/>
+                <w:sz w:val="24"/>
+                <w:szCs w:val="24"/>
+                <w:b/>
+                <w:color w:val="FFFFFF"/>
               </w:rPr>
               <w:t xml:space="preserve">سقف مبلغ (میلیارد ریال)</w:t>
             </w:r>
@@ -615,15 +796,21 @@
         <w:tc>
           <w:tcPr>
             <w:tcW w:w="3071" w:type="dxa"/>
-            <w:shd w:val="clear" w:color="auto" w:fill="F2F2F2"/>
-          </w:tcPr>
-          <w:p>
-            <w:pPr>
-              <w:bidi/>
-            </w:pPr>
-            <w:r>
-              <w:rPr>
-                <w:rtl/>
+            <w:shd w:val="clear" w:color="auto" w:fill="1F5132"/>
+          </w:tcPr>
+          <w:p>
+            <w:pPr>
+              <w:bidi/>
+              <w:spacing w:after="40" w:line="264" w:lineRule="auto"/>
+            </w:pPr>
+            <w:r>
+              <w:rPr>
+                <w:rFonts w:ascii="B Nazanin" w:hAnsi="B Nazanin" w:cs="B Nazanin" w:eastAsia="B Nazanin"/>
+                <w:rtl/>
+                <w:sz w:val="24"/>
+                <w:szCs w:val="24"/>
+                <w:b/>
+                <w:color w:val="FFFFFF"/>
               </w:rPr>
               <w:t xml:space="preserve">روش انجام</w:t>
             </w:r>
@@ -632,15 +819,21 @@
         <w:tc>
           <w:tcPr>
             <w:tcW w:w="2340" w:type="dxa"/>
-            <w:shd w:val="clear" w:color="auto" w:fill="F2F2F2"/>
-          </w:tcPr>
-          <w:p>
-            <w:pPr>
-              <w:bidi/>
-            </w:pPr>
-            <w:r>
-              <w:rPr>
-                <w:rtl/>
+            <w:shd w:val="clear" w:color="auto" w:fill="1F5132"/>
+          </w:tcPr>
+          <w:p>
+            <w:pPr>
+              <w:bidi/>
+              <w:spacing w:after="40" w:line="264" w:lineRule="auto"/>
+            </w:pPr>
+            <w:r>
+              <w:rPr>
+                <w:rFonts w:ascii="B Nazanin" w:hAnsi="B Nazanin" w:cs="B Nazanin" w:eastAsia="B Nazanin"/>
+                <w:rtl/>
+                <w:sz w:val="24"/>
+                <w:szCs w:val="24"/>
+                <w:b/>
+                <w:color w:val="FFFFFF"/>
               </w:rPr>
               <w:t xml:space="preserve">مرجع تصویب</w:t>
             </w:r>
@@ -651,14 +844,19 @@
         <w:tc>
           <w:tcPr>
             <w:tcW w:w="2076" w:type="dxa"/>
-          </w:tcPr>
-          <w:p>
-            <w:pPr>
-              <w:bidi/>
-            </w:pPr>
-            <w:r>
-              <w:rPr>
-                <w:rtl/>
+            <w:shd w:val="clear" w:color="auto" w:fill="FFFFFF"/>
+          </w:tcPr>
+          <w:p>
+            <w:pPr>
+              <w:bidi/>
+              <w:spacing w:after="40" w:line="264" w:lineRule="auto"/>
+            </w:pPr>
+            <w:r>
+              <w:rPr>
+                <w:rFonts w:ascii="B Nazanin" w:hAnsi="B Nazanin" w:cs="B Nazanin" w:eastAsia="B Nazanin"/>
+                <w:rtl/>
+                <w:sz w:val="24"/>
+                <w:szCs w:val="24"/>
               </w:rPr>
               <w:t xml:space="preserve">کوچک</w:t>
             </w:r>
@@ -667,14 +865,19 @@
         <w:tc>
           <w:tcPr>
             <w:tcW w:w="1873" w:type="dxa"/>
-          </w:tcPr>
-          <w:p>
-            <w:pPr>
-              <w:bidi/>
-            </w:pPr>
-            <w:r>
-              <w:rPr>
-                <w:rtl/>
+            <w:shd w:val="clear" w:color="auto" w:fill="FFFFFF"/>
+          </w:tcPr>
+          <w:p>
+            <w:pPr>
+              <w:bidi/>
+              <w:spacing w:after="40" w:line="264" w:lineRule="auto"/>
+            </w:pPr>
+            <w:r>
+              <w:rPr>
+                <w:rFonts w:ascii="B Nazanin" w:hAnsi="B Nazanin" w:cs="B Nazanin" w:eastAsia="B Nazanin"/>
+                <w:rtl/>
+                <w:sz w:val="24"/>
+                <w:szCs w:val="24"/>
               </w:rPr>
               <w:t xml:space="preserve">تا ۱۰</w:t>
             </w:r>
@@ -683,14 +886,19 @@
         <w:tc>
           <w:tcPr>
             <w:tcW w:w="3071" w:type="dxa"/>
-          </w:tcPr>
-          <w:p>
-            <w:pPr>
-              <w:bidi/>
-            </w:pPr>
-            <w:r>
-              <w:rPr>
-                <w:rtl/>
+            <w:shd w:val="clear" w:color="auto" w:fill="FFFFFF"/>
+          </w:tcPr>
+          <w:p>
+            <w:pPr>
+              <w:bidi/>
+              <w:spacing w:after="40" w:line="264" w:lineRule="auto"/>
+            </w:pPr>
+            <w:r>
+              <w:rPr>
+                <w:rFonts w:ascii="B Nazanin" w:hAnsi="B Nazanin" w:cs="B Nazanin" w:eastAsia="B Nazanin"/>
+                <w:rtl/>
+                <w:sz w:val="24"/>
+                <w:szCs w:val="24"/>
               </w:rPr>
               <w:t xml:space="preserve">تحقیق بها و خرید مستقیم توسط مأمور خرید</w:t>
             </w:r>
@@ -699,14 +907,19 @@
         <w:tc>
           <w:tcPr>
             <w:tcW w:w="2340" w:type="dxa"/>
-          </w:tcPr>
-          <w:p>
-            <w:pPr>
-              <w:bidi/>
-            </w:pPr>
-            <w:r>
-              <w:rPr>
-                <w:rtl/>
+            <w:shd w:val="clear" w:color="auto" w:fill="FFFFFF"/>
+          </w:tcPr>
+          <w:p>
+            <w:pPr>
+              <w:bidi/>
+              <w:spacing w:after="40" w:line="264" w:lineRule="auto"/>
+            </w:pPr>
+            <w:r>
+              <w:rPr>
+                <w:rFonts w:ascii="B Nazanin" w:hAnsi="B Nazanin" w:cs="B Nazanin" w:eastAsia="B Nazanin"/>
+                <w:rtl/>
+                <w:sz w:val="24"/>
+                <w:szCs w:val="24"/>
               </w:rPr>
               <w:t xml:space="preserve">مدیر واحد بازرگانی</w:t>
             </w:r>
@@ -717,14 +930,19 @@
         <w:tc>
           <w:tcPr>
             <w:tcW w:w="2076" w:type="dxa"/>
-          </w:tcPr>
-          <w:p>
-            <w:pPr>
-              <w:bidi/>
-            </w:pPr>
-            <w:r>
-              <w:rPr>
-                <w:rtl/>
+            <w:shd w:val="clear" w:color="auto" w:fill="EEF6F0"/>
+          </w:tcPr>
+          <w:p>
+            <w:pPr>
+              <w:bidi/>
+              <w:spacing w:after="40" w:line="264" w:lineRule="auto"/>
+            </w:pPr>
+            <w:r>
+              <w:rPr>
+                <w:rFonts w:ascii="B Nazanin" w:hAnsi="B Nazanin" w:cs="B Nazanin" w:eastAsia="B Nazanin"/>
+                <w:rtl/>
+                <w:sz w:val="24"/>
+                <w:szCs w:val="24"/>
               </w:rPr>
               <w:t xml:space="preserve">متوسط</w:t>
             </w:r>
@@ -733,14 +951,19 @@
         <w:tc>
           <w:tcPr>
             <w:tcW w:w="1873" w:type="dxa"/>
-          </w:tcPr>
-          <w:p>
-            <w:pPr>
-              <w:bidi/>
-            </w:pPr>
-            <w:r>
-              <w:rPr>
-                <w:rtl/>
+            <w:shd w:val="clear" w:color="auto" w:fill="EEF6F0"/>
+          </w:tcPr>
+          <w:p>
+            <w:pPr>
+              <w:bidi/>
+              <w:spacing w:after="40" w:line="264" w:lineRule="auto"/>
+            </w:pPr>
+            <w:r>
+              <w:rPr>
+                <w:rFonts w:ascii="B Nazanin" w:hAnsi="B Nazanin" w:cs="B Nazanin" w:eastAsia="B Nazanin"/>
+                <w:rtl/>
+                <w:sz w:val="24"/>
+                <w:szCs w:val="24"/>
               </w:rPr>
               <w:t xml:space="preserve">بیش از ۱۰ تا ۱۵۰</w:t>
             </w:r>
@@ -749,14 +972,19 @@
         <w:tc>
           <w:tcPr>
             <w:tcW w:w="3071" w:type="dxa"/>
-          </w:tcPr>
-          <w:p>
-            <w:pPr>
-              <w:bidi/>
-            </w:pPr>
-            <w:r>
-              <w:rPr>
-                <w:rtl/>
+            <w:shd w:val="clear" w:color="auto" w:fill="EEF6F0"/>
+          </w:tcPr>
+          <w:p>
+            <w:pPr>
+              <w:bidi/>
+              <w:spacing w:after="40" w:line="264" w:lineRule="auto"/>
+            </w:pPr>
+            <w:r>
+              <w:rPr>
+                <w:rFonts w:ascii="B Nazanin" w:hAnsi="B Nazanin" w:cs="B Nazanin" w:eastAsia="B Nazanin"/>
+                <w:rtl/>
+                <w:sz w:val="24"/>
+                <w:szCs w:val="24"/>
               </w:rPr>
               <w:t xml:space="preserve">استعلام کتبی از حداقل سه تأمین‌کننده</w:t>
             </w:r>
@@ -765,14 +993,19 @@
         <w:tc>
           <w:tcPr>
             <w:tcW w:w="2340" w:type="dxa"/>
-          </w:tcPr>
-          <w:p>
-            <w:pPr>
-              <w:bidi/>
-            </w:pPr>
-            <w:r>
-              <w:rPr>
-                <w:rtl/>
+            <w:shd w:val="clear" w:color="auto" w:fill="EEF6F0"/>
+          </w:tcPr>
+          <w:p>
+            <w:pPr>
+              <w:bidi/>
+              <w:spacing w:after="40" w:line="264" w:lineRule="auto"/>
+            </w:pPr>
+            <w:r>
+              <w:rPr>
+                <w:rFonts w:ascii="B Nazanin" w:hAnsi="B Nazanin" w:cs="B Nazanin" w:eastAsia="B Nazanin"/>
+                <w:rtl/>
+                <w:sz w:val="24"/>
+                <w:szCs w:val="24"/>
               </w:rPr>
               <w:t xml:space="preserve">مدیرعامل</w:t>
             </w:r>
@@ -783,14 +1016,19 @@
         <w:tc>
           <w:tcPr>
             <w:tcW w:w="2076" w:type="dxa"/>
-          </w:tcPr>
-          <w:p>
-            <w:pPr>
-              <w:bidi/>
-            </w:pPr>
-            <w:r>
-              <w:rPr>
-                <w:rtl/>
+            <w:shd w:val="clear" w:color="auto" w:fill="FFFFFF"/>
+          </w:tcPr>
+          <w:p>
+            <w:pPr>
+              <w:bidi/>
+              <w:spacing w:after="40" w:line="264" w:lineRule="auto"/>
+            </w:pPr>
+            <w:r>
+              <w:rPr>
+                <w:rFonts w:ascii="B Nazanin" w:hAnsi="B Nazanin" w:cs="B Nazanin" w:eastAsia="B Nazanin"/>
+                <w:rtl/>
+                <w:sz w:val="24"/>
+                <w:szCs w:val="24"/>
               </w:rPr>
               <w:t xml:space="preserve">بزرگ</w:t>
             </w:r>
@@ -799,14 +1037,19 @@
         <w:tc>
           <w:tcPr>
             <w:tcW w:w="1873" w:type="dxa"/>
-          </w:tcPr>
-          <w:p>
-            <w:pPr>
-              <w:bidi/>
-            </w:pPr>
-            <w:r>
-              <w:rPr>
-                <w:rtl/>
+            <w:shd w:val="clear" w:color="auto" w:fill="FFFFFF"/>
+          </w:tcPr>
+          <w:p>
+            <w:pPr>
+              <w:bidi/>
+              <w:spacing w:after="40" w:line="264" w:lineRule="auto"/>
+            </w:pPr>
+            <w:r>
+              <w:rPr>
+                <w:rFonts w:ascii="B Nazanin" w:hAnsi="B Nazanin" w:cs="B Nazanin" w:eastAsia="B Nazanin"/>
+                <w:rtl/>
+                <w:sz w:val="24"/>
+                <w:szCs w:val="24"/>
               </w:rPr>
               <w:t xml:space="preserve">بیش از ۱۵۰</w:t>
             </w:r>
@@ -815,14 +1058,19 @@
         <w:tc>
           <w:tcPr>
             <w:tcW w:w="3071" w:type="dxa"/>
-          </w:tcPr>
-          <w:p>
-            <w:pPr>
-              <w:bidi/>
-            </w:pPr>
-            <w:r>
-              <w:rPr>
-                <w:rtl/>
+            <w:shd w:val="clear" w:color="auto" w:fill="FFFFFF"/>
+          </w:tcPr>
+          <w:p>
+            <w:pPr>
+              <w:bidi/>
+              <w:spacing w:after="40" w:line="264" w:lineRule="auto"/>
+            </w:pPr>
+            <w:r>
+              <w:rPr>
+                <w:rFonts w:ascii="B Nazanin" w:hAnsi="B Nazanin" w:cs="B Nazanin" w:eastAsia="B Nazanin"/>
+                <w:rtl/>
+                <w:sz w:val="24"/>
+                <w:szCs w:val="24"/>
               </w:rPr>
               <w:t xml:space="preserve">مناقصه محدود/عمومی یا استعلام بین‌المللی با تشریفات کمیسیون</w:t>
             </w:r>
@@ -831,14 +1079,19 @@
         <w:tc>
           <w:tcPr>
             <w:tcW w:w="2340" w:type="dxa"/>
-          </w:tcPr>
-          <w:p>
-            <w:pPr>
-              <w:bidi/>
-            </w:pPr>
-            <w:r>
-              <w:rPr>
-                <w:rtl/>
+            <w:shd w:val="clear" w:color="auto" w:fill="FFFFFF"/>
+          </w:tcPr>
+          <w:p>
+            <w:pPr>
+              <w:bidi/>
+              <w:spacing w:after="40" w:line="264" w:lineRule="auto"/>
+            </w:pPr>
+            <w:r>
+              <w:rPr>
+                <w:rFonts w:ascii="B Nazanin" w:hAnsi="B Nazanin" w:cs="B Nazanin" w:eastAsia="B Nazanin"/>
+                <w:rtl/>
+                <w:sz w:val="24"/>
+                <w:szCs w:val="24"/>
               </w:rPr>
               <w:t xml:space="preserve">کمیسیون معاملات + مدیرعامل</w:t>
             </w:r>
@@ -849,14 +1102,19 @@
         <w:tc>
           <w:tcPr>
             <w:tcW w:w="2076" w:type="dxa"/>
-          </w:tcPr>
-          <w:p>
-            <w:pPr>
-              <w:bidi/>
-            </w:pPr>
-            <w:r>
-              <w:rPr>
-                <w:rtl/>
+            <w:shd w:val="clear" w:color="auto" w:fill="EEF6F0"/>
+          </w:tcPr>
+          <w:p>
+            <w:pPr>
+              <w:bidi/>
+              <w:spacing w:after="40" w:line="264" w:lineRule="auto"/>
+            </w:pPr>
+            <w:r>
+              <w:rPr>
+                <w:rFonts w:ascii="B Nazanin" w:hAnsi="B Nazanin" w:cs="B Nazanin" w:eastAsia="B Nazanin"/>
+                <w:rtl/>
+                <w:sz w:val="24"/>
+                <w:szCs w:val="24"/>
               </w:rPr>
               <w:t xml:space="preserve">بزرگ ویژه</w:t>
             </w:r>
@@ -865,14 +1123,19 @@
         <w:tc>
           <w:tcPr>
             <w:tcW w:w="1873" w:type="dxa"/>
-          </w:tcPr>
-          <w:p>
-            <w:pPr>
-              <w:bidi/>
-            </w:pPr>
-            <w:r>
-              <w:rPr>
-                <w:rtl/>
+            <w:shd w:val="clear" w:color="auto" w:fill="EEF6F0"/>
+          </w:tcPr>
+          <w:p>
+            <w:pPr>
+              <w:bidi/>
+              <w:spacing w:after="40" w:line="264" w:lineRule="auto"/>
+            </w:pPr>
+            <w:r>
+              <w:rPr>
+                <w:rFonts w:ascii="B Nazanin" w:hAnsi="B Nazanin" w:cs="B Nazanin" w:eastAsia="B Nazanin"/>
+                <w:rtl/>
+                <w:sz w:val="24"/>
+                <w:szCs w:val="24"/>
               </w:rPr>
               <w:t xml:space="preserve">بیش از ۲٬۰۰۰ یا بیش از ۱۰٪ سرمایه ثبتی</w:t>
             </w:r>
@@ -881,14 +1144,19 @@
         <w:tc>
           <w:tcPr>
             <w:tcW w:w="3071" w:type="dxa"/>
-          </w:tcPr>
-          <w:p>
-            <w:pPr>
-              <w:bidi/>
-            </w:pPr>
-            <w:r>
-              <w:rPr>
-                <w:rtl/>
+            <w:shd w:val="clear" w:color="auto" w:fill="EEF6F0"/>
+          </w:tcPr>
+          <w:p>
+            <w:pPr>
+              <w:bidi/>
+              <w:spacing w:after="40" w:line="264" w:lineRule="auto"/>
+            </w:pPr>
+            <w:r>
+              <w:rPr>
+                <w:rFonts w:ascii="B Nazanin" w:hAnsi="B Nazanin" w:cs="B Nazanin" w:eastAsia="B Nazanin"/>
+                <w:rtl/>
+                <w:sz w:val="24"/>
+                <w:szCs w:val="24"/>
               </w:rPr>
               <w:t xml:space="preserve">مانند بزرگ</w:t>
             </w:r>
@@ -897,14 +1165,19 @@
         <w:tc>
           <w:tcPr>
             <w:tcW w:w="2340" w:type="dxa"/>
-          </w:tcPr>
-          <w:p>
-            <w:pPr>
-              <w:bidi/>
-            </w:pPr>
-            <w:r>
-              <w:rPr>
-                <w:rtl/>
+            <w:shd w:val="clear" w:color="auto" w:fill="EEF6F0"/>
+          </w:tcPr>
+          <w:p>
+            <w:pPr>
+              <w:bidi/>
+              <w:spacing w:after="40" w:line="264" w:lineRule="auto"/>
+            </w:pPr>
+            <w:r>
+              <w:rPr>
+                <w:rFonts w:ascii="B Nazanin" w:hAnsi="B Nazanin" w:cs="B Nazanin" w:eastAsia="B Nazanin"/>
+                <w:rtl/>
+                <w:sz w:val="24"/>
+                <w:szCs w:val="24"/>
               </w:rPr>
               <w:t xml:space="preserve">هیئت‌مدیران</w:t>
             </w:r>
@@ -918,6 +1191,7 @@
       </w:pPr>
       <w:r>
         <w:rPr>
+          <w:rFonts w:ascii="B Nazanin" w:hAnsi="B Nazanin" w:cs="B Nazanin" w:eastAsia="B Nazanin"/>
           <w:b/>
           <w:bCs/>
           <w:rtl/>
@@ -936,6 +1210,7 @@
       </w:pPr>
       <w:r>
         <w:rPr>
+          <w:rFonts w:ascii="B Nazanin" w:hAnsi="B Nazanin" w:cs="B Nazanin" w:eastAsia="B Nazanin"/>
           <w:rtl/>
         </w:rPr>
         <w:t xml:space="preserve">مبنای تعیین طبقه برآورد اولیه واحد بازرگانی است؛ اگر مبلغ نهایی به طبقه بالاتر برسد، تشریفات آن طبقه لازم است.</w:t>
@@ -952,6 +1227,7 @@
       </w:pPr>
       <w:r>
         <w:rPr>
+          <w:rFonts w:ascii="B Nazanin" w:hAnsi="B Nazanin" w:cs="B Nazanin" w:eastAsia="B Nazanin"/>
           <w:rtl/>
         </w:rPr>
         <w:t xml:space="preserve">معاملات ارزی با نرخ ارز مرکز مبادله (یا نرخ مؤثر تأمین ارز شرکت) در روز تصویب به ریال تبدیل می‌شوند.</w:t>
@@ -968,6 +1244,7 @@
       </w:pPr>
       <w:r>
         <w:rPr>
+          <w:rFonts w:ascii="B Nazanin" w:hAnsi="B Nazanin" w:cs="B Nazanin" w:eastAsia="B Nazanin"/>
           <w:rtl/>
         </w:rPr>
         <w:t xml:space="preserve">قراردادهای چندساله یا چندمحموله‌ای با کل مبلغ دوره محاسبه می‌شوند.</w:t>
@@ -984,6 +1261,7 @@
       </w:pPr>
       <w:r>
         <w:rPr>
+          <w:rFonts w:ascii="B Nazanin" w:hAnsi="B Nazanin" w:cs="B Nazanin" w:eastAsia="B Nazanin"/>
           <w:rtl/>
         </w:rPr>
         <w:t xml:space="preserve">افزایش یا کاهش تا ۲۵٪ مبلغ قرارداد، با تصویب مرجع اصلی مجاز است؛ بیش از آن معامله جدید حساب می‌شود.</w:t>
@@ -996,6 +1274,7 @@
       </w:pPr>
       <w:r>
         <w:rPr>
+          <w:rFonts w:ascii="B Nazanin" w:hAnsi="B Nazanin" w:cs="B Nazanin" w:eastAsia="B Nazanin"/>
           <w:rtl/>
         </w:rPr>
         <w:t xml:space="preserve">فصل سوم: ارکان معاملات</w:t>
@@ -1007,6 +1286,7 @@
       </w:pPr>
       <w:r>
         <w:rPr>
+          <w:rFonts w:ascii="B Nazanin" w:hAnsi="B Nazanin" w:cs="B Nazanin" w:eastAsia="B Nazanin"/>
           <w:b/>
           <w:bCs/>
           <w:rtl/>
@@ -1015,6 +1295,7 @@
       </w:r>
       <w:r>
         <w:rPr>
+          <w:rFonts w:ascii="B Nazanin" w:hAnsi="B Nazanin" w:cs="B Nazanin" w:eastAsia="B Nazanin"/>
           <w:rtl/>
         </w:rPr>
         <w:t xml:space="preserve"> کمیسیون با حکم مدیرعامل و برای یک سال تشکیل می‌شود و اعضای آن عبارت‌اند از:</w:t>
@@ -1031,6 +1312,7 @@
       </w:pPr>
       <w:r>
         <w:rPr>
+          <w:rFonts w:ascii="B Nazanin" w:hAnsi="B Nazanin" w:cs="B Nazanin" w:eastAsia="B Nazanin"/>
           <w:rtl/>
         </w:rPr>
         <w:t xml:space="preserve">مدیر مالی (رئیس کمیسیون)</w:t>
@@ -1047,6 +1329,7 @@
       </w:pPr>
       <w:r>
         <w:rPr>
+          <w:rFonts w:ascii="B Nazanin" w:hAnsi="B Nazanin" w:cs="B Nazanin" w:eastAsia="B Nazanin"/>
           <w:rtl/>
         </w:rPr>
         <w:t xml:space="preserve">مدیر واحد بازرگانی</w:t>
@@ -1063,6 +1346,7 @@
       </w:pPr>
       <w:r>
         <w:rPr>
+          <w:rFonts w:ascii="B Nazanin" w:hAnsi="B Nazanin" w:cs="B Nazanin" w:eastAsia="B Nazanin"/>
           <w:rtl/>
         </w:rPr>
         <w:t xml:space="preserve">مسئول کنترل کیفیت یا کارشناس فنی برنج</w:t>
@@ -1079,6 +1363,7 @@
       </w:pPr>
       <w:r>
         <w:rPr>
+          <w:rFonts w:ascii="B Nazanin" w:hAnsi="B Nazanin" w:cs="B Nazanin" w:eastAsia="B Nazanin"/>
           <w:rtl/>
         </w:rPr>
         <w:t xml:space="preserve">مشاور حقوقی شرکت (بدون حق رأی یا با حق رأی، به تشخیص هیئت‌مدیران)</w:t>
@@ -1095,6 +1380,7 @@
       </w:pPr>
       <w:r>
         <w:rPr>
+          <w:rFonts w:ascii="B Nazanin" w:hAnsi="B Nazanin" w:cs="B Nazanin" w:eastAsia="B Nazanin"/>
           <w:rtl/>
         </w:rPr>
         <w:t xml:space="preserve">یکی از شرکا یا عضو غیرموظف هیئت‌مدیران به انتخاب هیئت‌مدیران</w:t>
@@ -1106,6 +1392,7 @@
       </w:pPr>
       <w:r>
         <w:rPr>
+          <w:rFonts w:ascii="B Nazanin" w:hAnsi="B Nazanin" w:cs="B Nazanin" w:eastAsia="B Nazanin"/>
           <w:rtl/>
         </w:rPr>
         <w:t xml:space="preserve">حسابرس داخلی با حق حضور و بدون حق رأی دعوت می‌شود. مدیرعامل عضو کمیسیون نیست؛ تصمیم کمیسیون را تأیید یا برای بازبینی بازمی‌گرداند.</w:t>
@@ -1117,6 +1404,7 @@
       </w:pPr>
       <w:r>
         <w:rPr>
+          <w:rFonts w:ascii="B Nazanin" w:hAnsi="B Nazanin" w:cs="B Nazanin" w:eastAsia="B Nazanin"/>
           <w:b/>
           <w:bCs/>
           <w:rtl/>
@@ -1125,6 +1413,7 @@
       </w:r>
       <w:r>
         <w:rPr>
+          <w:rFonts w:ascii="B Nazanin" w:hAnsi="B Nazanin" w:cs="B Nazanin" w:eastAsia="B Nazanin"/>
           <w:rtl/>
         </w:rPr>
         <w:t xml:space="preserve"> جلسه با حضور حداقل سه عضو رسمی است و تصمیمات با اکثریت آراء حاضران گرفته می‌شود. صورتجلسه باید شامل موضوع، پیشنهادهای رسیده، دلیل انتخاب برنده و نظر مخالف (اگر باشد) باشد و به امضای همه حاضران برسد. در موارد فوری (مثل نوسان قیمت جهانی)، جلسه مجازی با ثبت آراء کتبی معتبر است.</w:t>
@@ -1136,6 +1425,7 @@
       </w:pPr>
       <w:r>
         <w:rPr>
+          <w:rFonts w:ascii="B Nazanin" w:hAnsi="B Nazanin" w:cs="B Nazanin" w:eastAsia="B Nazanin"/>
           <w:b/>
           <w:bCs/>
           <w:rtl/>
@@ -1144,6 +1434,7 @@
       </w:r>
       <w:r>
         <w:rPr>
+          <w:rFonts w:ascii="B Nazanin" w:hAnsi="B Nazanin" w:cs="B Nazanin" w:eastAsia="B Nazanin"/>
           <w:rtl/>
         </w:rPr>
         <w:t xml:space="preserve"> تهیه برنامه سالانه واردات (حجم، مبدأ، زمان‌بندی)، نگهداری فهرست تأمین‌کنندگان معتبر، برآورد مبلغ معاملات، انجام استعلام‌ها و پیگیری اجرای قراردادها.</w:t>
@@ -1155,6 +1446,7 @@
       </w:pPr>
       <w:r>
         <w:rPr>
+          <w:rFonts w:ascii="B Nazanin" w:hAnsi="B Nazanin" w:cs="B Nazanin" w:eastAsia="B Nazanin"/>
           <w:b/>
           <w:bCs/>
           <w:rtl/>
@@ -1163,6 +1455,7 @@
       </w:r>
       <w:r>
         <w:rPr>
+          <w:rFonts w:ascii="B Nazanin" w:hAnsi="B Nazanin" w:cs="B Nazanin" w:eastAsia="B Nazanin"/>
           <w:rtl/>
         </w:rPr>
         <w:t xml:space="preserve"> همه اسناد تعهدآور طبق آخرین آگهی صاحبان امضای مجاز در روزنامه رسمی امضا می‌شوند. امضای قرارداد، سفارش خرید یا فرم گشایش اعتبار اسنادی پیش از طی تشریفات این آیین‌نامه ممنوع است.</w:t>
@@ -1175,6 +1468,7 @@
       </w:pPr>
       <w:r>
         <w:rPr>
+          <w:rFonts w:ascii="B Nazanin" w:hAnsi="B Nazanin" w:cs="B Nazanin" w:eastAsia="B Nazanin"/>
           <w:rtl/>
         </w:rPr>
         <w:t xml:space="preserve">فصل چهارم: روش‌های انجام معامله</w:t>
@@ -1186,6 +1480,7 @@
       </w:pPr>
       <w:r>
         <w:rPr>
+          <w:rFonts w:ascii="B Nazanin" w:hAnsi="B Nazanin" w:cs="B Nazanin" w:eastAsia="B Nazanin"/>
           <w:b/>
           <w:bCs/>
           <w:rtl/>
@@ -1194,6 +1489,7 @@
       </w:r>
       <w:r>
         <w:rPr>
+          <w:rFonts w:ascii="B Nazanin" w:hAnsi="B Nazanin" w:cs="B Nazanin" w:eastAsia="B Nazanin"/>
           <w:rtl/>
         </w:rPr>
         <w:t xml:space="preserve"> مأمور خرید پس از تحقیق بها، کالا یا خدمت را با کمترین قیمت مناسب تهیه می‌کند و فاکتور رسمی با تأیید مدیر واحد بازرگانی به واحد مالی تحویل می‌شود.</w:t>
@@ -1205,6 +1501,7 @@
       </w:pPr>
       <w:r>
         <w:rPr>
+          <w:rFonts w:ascii="B Nazanin" w:hAnsi="B Nazanin" w:cs="B Nazanin" w:eastAsia="B Nazanin"/>
           <w:b/>
           <w:bCs/>
           <w:rtl/>
@@ -1213,6 +1510,7 @@
       </w:r>
       <w:r>
         <w:rPr>
+          <w:rFonts w:ascii="B Nazanin" w:hAnsi="B Nazanin" w:cs="B Nazanin" w:eastAsia="B Nazanin"/>
           <w:rtl/>
         </w:rPr>
         <w:t xml:space="preserve"> استعلام کتبی از حداقل سه تأمین‌کننده با شرایط یکسان (مشخصات، زمان تحویل، شرایط پرداخت) گرفته می‌شود. کمتر از سه پاسخ تنها با ثبت دلیل و تأیید مدیرعامل پذیرفتنی است.</w:t>
@@ -1224,6 +1522,7 @@
       </w:pPr>
       <w:r>
         <w:rPr>
+          <w:rFonts w:ascii="B Nazanin" w:hAnsi="B Nazanin" w:cs="B Nazanin" w:eastAsia="B Nazanin"/>
           <w:b/>
           <w:bCs/>
           <w:rtl/>
@@ -1232,6 +1531,7 @@
       </w:r>
       <w:r>
         <w:rPr>
+          <w:rFonts w:ascii="B Nazanin" w:hAnsi="B Nazanin" w:cs="B Nazanin" w:eastAsia="B Nazanin"/>
           <w:rtl/>
         </w:rPr>
         <w:t xml:space="preserve"> از راه مناقصه محدود (دعوت از حداقل پنج تأمین‌کننده فهرست معتبر) یا مناقصه عمومی (آگهی) انجام می‌شود:</w:t>
@@ -1248,6 +1548,7 @@
       </w:pPr>
       <w:r>
         <w:rPr>
+          <w:rFonts w:ascii="B Nazanin" w:hAnsi="B Nazanin" w:cs="B Nazanin" w:eastAsia="B Nazanin"/>
           <w:rtl/>
         </w:rPr>
         <w:t xml:space="preserve">تهیه اسناد مناقصه: مشخصات فنی، شرایط قرارداد، مبلغ تضمین شرکت در مناقصه (حداقل ۵٪ برآورد)، مهلت و معیارهای ارزیابی</w:t>
@@ -1264,6 +1565,7 @@
       </w:pPr>
       <w:r>
         <w:rPr>
+          <w:rFonts w:ascii="B Nazanin" w:hAnsi="B Nazanin" w:cs="B Nazanin" w:eastAsia="B Nazanin"/>
           <w:rtl/>
         </w:rPr>
         <w:t xml:space="preserve">دریافت پیشنهادها در پاکت لاک‌ومهر یا سامانه الکترونیکی با ثبت زمان</w:t>
@@ -1280,6 +1582,7 @@
       </w:pPr>
       <w:r>
         <w:rPr>
+          <w:rFonts w:ascii="B Nazanin" w:hAnsi="B Nazanin" w:cs="B Nazanin" w:eastAsia="B Nazanin"/>
           <w:rtl/>
         </w:rPr>
         <w:t xml:space="preserve">گشایش همزمان پاکت‌ها در جلسه کمیسیون</w:t>
@@ -1296,6 +1599,7 @@
       </w:pPr>
       <w:r>
         <w:rPr>
+          <w:rFonts w:ascii="B Nazanin" w:hAnsi="B Nazanin" w:cs="B Nazanin" w:eastAsia="B Nazanin"/>
           <w:rtl/>
         </w:rPr>
         <w:t xml:space="preserve">ارزیابی فنی (کیفیت، سابقه، توان تحویل) و سپس ارزیابی قیمتی</w:t>
@@ -1312,6 +1616,7 @@
       </w:pPr>
       <w:r>
         <w:rPr>
+          <w:rFonts w:ascii="B Nazanin" w:hAnsi="B Nazanin" w:cs="B Nazanin" w:eastAsia="B Nazanin"/>
           <w:rtl/>
         </w:rPr>
         <w:t xml:space="preserve">اعلام برنده اول و دوم؛ اگر برنده اول ظرف ۷ روز قرارداد نبندد، تضمین او ضبط و با نفر دوم قرارداد بسته می‌شود</w:t>
@@ -1323,6 +1628,7 @@
       </w:pPr>
       <w:r>
         <w:rPr>
+          <w:rFonts w:ascii="B Nazanin" w:hAnsi="B Nazanin" w:cs="B Nazanin" w:eastAsia="B Nazanin"/>
           <w:rtl/>
         </w:rPr>
         <w:t xml:space="preserve">کمیسیون می‌تواند با ثبت دلیل همه پیشنهادها را رد کند. اگر کمتر از دو پیشنهاد برسد، مناقصه یک بار تجدید می‌شود.</w:t>
@@ -1334,6 +1640,7 @@
       </w:pPr>
       <w:r>
         <w:rPr>
+          <w:rFonts w:ascii="B Nazanin" w:hAnsi="B Nazanin" w:cs="B Nazanin" w:eastAsia="B Nazanin"/>
           <w:b/>
           <w:bCs/>
           <w:rtl/>
@@ -1342,6 +1649,7 @@
       </w:r>
       <w:r>
         <w:rPr>
+          <w:rFonts w:ascii="B Nazanin" w:hAnsi="B Nazanin" w:cs="B Nazanin" w:eastAsia="B Nazanin"/>
           <w:rtl/>
         </w:rPr>
         <w:t xml:space="preserve"> در موارد زیر معامله بدون مناقصه و با مذاکره مستقیم انجام می‌شود؛ با پیشنهاد مستدل واحد بازرگانی، تصویب کمیسیون و تأیید مدیرعامل (و برای معاملات بزرگ ویژه، هیئت‌مدیران):</w:t>
@@ -1358,6 +1666,7 @@
       </w:pPr>
       <w:r>
         <w:rPr>
+          <w:rFonts w:ascii="B Nazanin" w:hAnsi="B Nazanin" w:cs="B Nazanin" w:eastAsia="B Nazanin"/>
           <w:rtl/>
         </w:rPr>
         <w:t xml:space="preserve">کالا یا خدمت تنها یک تأمین‌کننده دارد (مثل نمایندگی انحصاری یک برند)</w:t>
@@ -1374,6 +1683,7 @@
       </w:pPr>
       <w:r>
         <w:rPr>
+          <w:rFonts w:ascii="B Nazanin" w:hAnsi="B Nazanin" w:cs="B Nazanin" w:eastAsia="B Nazanin"/>
           <w:rtl/>
         </w:rPr>
         <w:t xml:space="preserve">خرید از بورس کالا، حراج رسمی یا نهادهای دولتی با قیمت مصوب</w:t>
@@ -1390,6 +1700,7 @@
       </w:pPr>
       <w:r>
         <w:rPr>
+          <w:rFonts w:ascii="B Nazanin" w:hAnsi="B Nazanin" w:cs="B Nazanin" w:eastAsia="B Nazanin"/>
           <w:rtl/>
         </w:rPr>
         <w:t xml:space="preserve">فرصت خرید با قیمت ویژه که مهلت آن کمتر از زمان لازم برای مناقصه است؛ با مستندسازی قیمت بازار جهانی همان روز</w:t>
@@ -1406,6 +1717,7 @@
       </w:pPr>
       <w:r>
         <w:rPr>
+          <w:rFonts w:ascii="B Nazanin" w:hAnsi="B Nazanin" w:cs="B Nazanin" w:eastAsia="B Nazanin"/>
           <w:rtl/>
         </w:rPr>
         <w:t xml:space="preserve">تمدید قرارداد با تأمین‌کننده‌ای که ارزیابی عملکرد سال قبل او «خوب» یا بالاتر بوده</w:t>
@@ -1422,6 +1734,7 @@
       </w:pPr>
       <w:r>
         <w:rPr>
+          <w:rFonts w:ascii="B Nazanin" w:hAnsi="B Nazanin" w:cs="B Nazanin" w:eastAsia="B Nazanin"/>
           <w:rtl/>
         </w:rPr>
         <w:t xml:space="preserve">خدمات تخصصی (وکیل، حسابرس، کارشناس رسمی)</w:t>
@@ -1438,6 +1751,7 @@
       </w:pPr>
       <w:r>
         <w:rPr>
+          <w:rFonts w:ascii="B Nazanin" w:hAnsi="B Nazanin" w:cs="B Nazanin" w:eastAsia="B Nazanin"/>
           <w:rtl/>
         </w:rPr>
         <w:t xml:space="preserve">حوادث قهری و وضعیت اضطراری</w:t>
@@ -1449,6 +1763,7 @@
       </w:pPr>
       <w:r>
         <w:rPr>
+          <w:rFonts w:ascii="B Nazanin" w:hAnsi="B Nazanin" w:cs="B Nazanin" w:eastAsia="B Nazanin"/>
           <w:b/>
           <w:bCs/>
           <w:rtl/>
@@ -1457,6 +1772,7 @@
       </w:r>
       <w:r>
         <w:rPr>
+          <w:rFonts w:ascii="B Nazanin" w:hAnsi="B Nazanin" w:cs="B Nazanin" w:eastAsia="B Nazanin"/>
           <w:rtl/>
         </w:rPr>
         <w:t xml:space="preserve"> فروش اموال مازاد، کالای ضایعاتی و دارایی‌های ثابت با همان نصاب‌ها و معکوس روش مناقصه (انتخاب بالاترین قیمت) انجام می‌شود؛ قیمت پایه را کارشناس رسمی تعیین می‌کند.</w:t>
@@ -1469,6 +1785,7 @@
       </w:pPr>
       <w:r>
         <w:rPr>
+          <w:rFonts w:ascii="B Nazanin" w:hAnsi="B Nazanin" w:cs="B Nazanin" w:eastAsia="B Nazanin"/>
           <w:rtl/>
         </w:rPr>
         <w:t xml:space="preserve">فصل پنجم: معاملات خارجی و واردات برنج</w:t>
@@ -1480,6 +1797,7 @@
       </w:pPr>
       <w:r>
         <w:rPr>
+          <w:rFonts w:ascii="B Nazanin" w:hAnsi="B Nazanin" w:cs="B Nazanin" w:eastAsia="B Nazanin"/>
           <w:b/>
           <w:bCs/>
           <w:rtl/>
@@ -1488,6 +1806,7 @@
       </w:r>
       <w:r>
         <w:rPr>
+          <w:rFonts w:ascii="B Nazanin" w:hAnsi="B Nazanin" w:cs="B Nazanin" w:eastAsia="B Nazanin"/>
           <w:rtl/>
         </w:rPr>
         <w:t xml:space="preserve"> خرید خارجی تنها از تأمین‌کنندگان این فهرست مجاز است. شرط ورود به فهرست:</w:t>
@@ -1504,6 +1823,7 @@
       </w:pPr>
       <w:r>
         <w:rPr>
+          <w:rFonts w:ascii="B Nazanin" w:hAnsi="B Nazanin" w:cs="B Nazanin" w:eastAsia="B Nazanin"/>
           <w:rtl/>
         </w:rPr>
         <w:t xml:space="preserve">مدارک ثبت شرکت و مجوز صادرات در کشور مبدأ (مثل هند، پاکستان، تایلند، اروگوئه)</w:t>
@@ -1520,6 +1840,7 @@
       </w:pPr>
       <w:r>
         <w:rPr>
+          <w:rFonts w:ascii="B Nazanin" w:hAnsi="B Nazanin" w:cs="B Nazanin" w:eastAsia="B Nazanin"/>
           <w:rtl/>
         </w:rPr>
         <w:t xml:space="preserve">حداقل ۳ سال سابقه صادرات برنج و معرفی از دو خریدار قبلی</w:t>
@@ -1536,6 +1857,7 @@
       </w:pPr>
       <w:r>
         <w:rPr>
+          <w:rFonts w:ascii="B Nazanin" w:hAnsi="B Nazanin" w:cs="B Nazanin" w:eastAsia="B Nazanin"/>
           <w:rtl/>
         </w:rPr>
         <w:t xml:space="preserve">گواهی‌های کیفیت و بهداشت کارخانه (مثل ISO 22000 یا HACCP)</w:t>
@@ -1552,6 +1874,7 @@
       </w:pPr>
       <w:r>
         <w:rPr>
+          <w:rFonts w:ascii="B Nazanin" w:hAnsi="B Nazanin" w:cs="B Nazanin" w:eastAsia="B Nazanin"/>
           <w:rtl/>
         </w:rPr>
         <w:t xml:space="preserve">نمونه آزمایشی تأییدشده در آزمایشگاه مورد اعتماد شرکت</w:t>
@@ -1568,6 +1891,7 @@
       </w:pPr>
       <w:r>
         <w:rPr>
+          <w:rFonts w:ascii="B Nazanin" w:hAnsi="B Nazanin" w:cs="B Nazanin" w:eastAsia="B Nazanin"/>
           <w:rtl/>
         </w:rPr>
         <w:t xml:space="preserve">بررسی عدم قرارگیری در فهرست‌های محدودیت و امکان انتقال وجه از مسیر بانکی یا صرافی مجاز</w:t>
@@ -1579,6 +1903,7 @@
       </w:pPr>
       <w:r>
         <w:rPr>
+          <w:rFonts w:ascii="B Nazanin" w:hAnsi="B Nazanin" w:cs="B Nazanin" w:eastAsia="B Nazanin"/>
           <w:rtl/>
         </w:rPr>
         <w:t xml:space="preserve">فهرست هر سال بازبینی می‌شود و تأمین‌کننده‌ای که دو محموله مرجوعی یا تأخیر جدی داشته، حذف می‌شود.</w:t>
@@ -1590,6 +1915,7 @@
       </w:pPr>
       <w:r>
         <w:rPr>
+          <w:rFonts w:ascii="B Nazanin" w:hAnsi="B Nazanin" w:cs="B Nazanin" w:eastAsia="B Nazanin"/>
           <w:b/>
           <w:bCs/>
           <w:rtl/>
@@ -1598,6 +1924,7 @@
       </w:r>
       <w:r>
         <w:rPr>
+          <w:rFonts w:ascii="B Nazanin" w:hAnsi="B Nazanin" w:cs="B Nazanin" w:eastAsia="B Nazanin"/>
           <w:rtl/>
         </w:rPr>
         <w:t xml:space="preserve"> هر محموله به ترتیب این مراحل را طی می‌کند؛ هیچ مرحله‌ای پیش از تایید مرحله قبل آغاز نمی‌شود:</w:t>
@@ -1614,6 +1941,7 @@
       </w:pPr>
       <w:r>
         <w:rPr>
+          <w:rFonts w:ascii="B Nazanin" w:hAnsi="B Nazanin" w:cs="B Nazanin" w:eastAsia="B Nazanin"/>
           <w:b/>
           <w:bCs/>
           <w:rtl/>
@@ -1622,6 +1950,7 @@
       </w:r>
       <w:r>
         <w:rPr>
+          <w:rFonts w:ascii="B Nazanin" w:hAnsi="B Nazanin" w:cs="B Nazanin" w:eastAsia="B Nazanin"/>
           <w:rtl/>
         </w:rPr>
         <w:t xml:space="preserve"> دریافت پیش‌فاکتور (Proforma Invoice) از حداقل سه تأمین‌کننده با مشخصات نوع برنج، درصد شکسته، رطوبت، طول دانه، سال برداشت، بسته‌بندی، اینکوترمز و بندر تحویل.</w:t>
@@ -1638,6 +1967,7 @@
       </w:pPr>
       <w:r>
         <w:rPr>
+          <w:rFonts w:ascii="B Nazanin" w:hAnsi="B Nazanin" w:cs="B Nazanin" w:eastAsia="B Nazanin"/>
           <w:b/>
           <w:bCs/>
           <w:rtl/>
@@ -1646,6 +1976,7 @@
       </w:r>
       <w:r>
         <w:rPr>
+          <w:rFonts w:ascii="B Nazanin" w:hAnsi="B Nazanin" w:cs="B Nazanin" w:eastAsia="B Nazanin"/>
           <w:rtl/>
         </w:rPr>
         <w:t xml:space="preserve"> مقایسه قیمت تمام‌شده در انبار شرکت (کالا + حمل + بیمه + بازرسی + هزینه ارز + حقوق ورودی + ترخیص) و تصویب طبق نصاب ماده ۵.</w:t>
@@ -1662,6 +1993,7 @@
       </w:pPr>
       <w:r>
         <w:rPr>
+          <w:rFonts w:ascii="B Nazanin" w:hAnsi="B Nazanin" w:cs="B Nazanin" w:eastAsia="B Nazanin"/>
           <w:b/>
           <w:bCs/>
           <w:rtl/>
@@ -1670,6 +2002,7 @@
       </w:r>
       <w:r>
         <w:rPr>
+          <w:rFonts w:ascii="B Nazanin" w:hAnsi="B Nazanin" w:cs="B Nazanin" w:eastAsia="B Nazanin"/>
           <w:rtl/>
         </w:rPr>
         <w:t xml:space="preserve"> ثبت سفارش در سامانه جامع تجارت، اخذ مجوزهای لازم (سازمان حفظ نباتات، سازمان ملی استاندارد، سازمان غذا و دارو) و رعایت مقررات فصلی واردات برنج و تعرفه روز.</w:t>
@@ -1686,6 +2019,7 @@
       </w:pPr>
       <w:r>
         <w:rPr>
+          <w:rFonts w:ascii="B Nazanin" w:hAnsi="B Nazanin" w:cs="B Nazanin" w:eastAsia="B Nazanin"/>
           <w:b/>
           <w:bCs/>
           <w:rtl/>
@@ -1694,6 +2028,7 @@
       </w:r>
       <w:r>
         <w:rPr>
+          <w:rFonts w:ascii="B Nazanin" w:hAnsi="B Nazanin" w:cs="B Nazanin" w:eastAsia="B Nazanin"/>
           <w:rtl/>
         </w:rPr>
         <w:t xml:space="preserve"> بر پایه فرم استاندارد شرکت، با بندهای ماده ۱۸، به امضای صاحبان امضای مجاز.</w:t>
@@ -1710,6 +2045,7 @@
       </w:pPr>
       <w:r>
         <w:rPr>
+          <w:rFonts w:ascii="B Nazanin" w:hAnsi="B Nazanin" w:cs="B Nazanin" w:eastAsia="B Nazanin"/>
           <w:b/>
           <w:bCs/>
           <w:rtl/>
@@ -1718,6 +2054,7 @@
       </w:r>
       <w:r>
         <w:rPr>
+          <w:rFonts w:ascii="B Nazanin" w:hAnsi="B Nazanin" w:cs="B Nazanin" w:eastAsia="B Nazanin"/>
           <w:rtl/>
         </w:rPr>
         <w:t xml:space="preserve"> از مسیر بانکی مجاز و مرکز مبادله؛ اولویت با اعتبار اسنادی (LC) یا برات اسنادی است. هر پیش‌پرداخت بیش از ۲۰٪ فقط با ضمانت‌نامه بانکی معتبر بازپرداخت پیش‌پرداخت.</w:t>
@@ -1734,6 +2071,7 @@
       </w:pPr>
       <w:r>
         <w:rPr>
+          <w:rFonts w:ascii="B Nazanin" w:hAnsi="B Nazanin" w:cs="B Nazanin" w:eastAsia="B Nazanin"/>
           <w:b/>
           <w:bCs/>
           <w:rtl/>
@@ -1742,6 +2080,7 @@
       </w:r>
       <w:r>
         <w:rPr>
+          <w:rFonts w:ascii="B Nazanin" w:hAnsi="B Nazanin" w:cs="B Nazanin" w:eastAsia="B Nazanin"/>
           <w:rtl/>
         </w:rPr>
         <w:t xml:space="preserve"> بازرسی کمی و کیفی در بندر بارگیری توسط شرکت بازرسی بین‌المللی مورد تأیید (مثل SGS، Bureau Veritas، Intertek)؛ گواهی بازرسی جزو اسناد الزامی LC است.</w:t>
@@ -1758,6 +2097,7 @@
       </w:pPr>
       <w:r>
         <w:rPr>
+          <w:rFonts w:ascii="B Nazanin" w:hAnsi="B Nazanin" w:cs="B Nazanin" w:eastAsia="B Nazanin"/>
           <w:b/>
           <w:bCs/>
           <w:rtl/>
@@ -1766,6 +2106,7 @@
       </w:r>
       <w:r>
         <w:rPr>
+          <w:rFonts w:ascii="B Nazanin" w:hAnsi="B Nazanin" w:cs="B Nazanin" w:eastAsia="B Nazanin"/>
           <w:rtl/>
         </w:rPr>
         <w:t xml:space="preserve"> بیمه باربری با پوشش تمام خطر (Institute Cargo Clauses A) به ارزش ۱۱۰٪ بهای CIF؛ در شرایط FOB/CFR بیمه را شرکت پیش از بارگیری می‌خرد.</w:t>
@@ -1782,6 +2123,7 @@
       </w:pPr>
       <w:r>
         <w:rPr>
+          <w:rFonts w:ascii="B Nazanin" w:hAnsi="B Nazanin" w:cs="B Nazanin" w:eastAsia="B Nazanin"/>
           <w:b/>
           <w:bCs/>
           <w:rtl/>
@@ -1790,6 +2132,7 @@
       </w:r>
       <w:r>
         <w:rPr>
+          <w:rFonts w:ascii="B Nazanin" w:hAnsi="B Nazanin" w:cs="B Nazanin" w:eastAsia="B Nazanin"/>
           <w:rtl/>
         </w:rPr>
         <w:t xml:space="preserve"> ترخیص از گمرک توسط حق‌العمل‌کار منتخب استعلام، نمونه‌برداری مجدد در بندر مقصد، و صورتجلسه تحویل انبار با وزن و کیفیت واقعی.</w:t>
@@ -1801,6 +2144,7 @@
       </w:pPr>
       <w:r>
         <w:rPr>
+          <w:rFonts w:ascii="B Nazanin" w:hAnsi="B Nazanin" w:cs="B Nazanin" w:eastAsia="B Nazanin"/>
           <w:b/>
           <w:bCs/>
           <w:rtl/>
@@ -1810,11 +2154,25 @@
     </w:p>
     <w:tbl>
       <w:tblPr>
-        <w:bidiVisual/>
         <w:tblStyle w:val="TableGrid"/>
         <w:tblW w:w="0" w:type="auto"/>
+        <w:jc w:val="center"/>
         <w:tblLayout w:type="fixed"/>
         <w:tblLook w:val="04A0" w:firstRow="1" w:lastRow="0" w:firstColumn="0" w:lastColumn="0" w:noHBand="0" w:noVBand="1"/>
+        <w:tblBorders>
+          <w:top w:val="single" w:sz="4" w:space="0" w:color="A9CBB4"/>
+          <w:left w:val="single" w:sz="4" w:space="0" w:color="A9CBB4"/>
+          <w:bottom w:val="single" w:sz="4" w:space="0" w:color="A9CBB4"/>
+          <w:right w:val="single" w:sz="4" w:space="0" w:color="A9CBB4"/>
+          <w:insideH w:val="single" w:sz="4" w:space="0" w:color="A9CBB4"/>
+          <w:insideV w:val="single" w:sz="4" w:space="0" w:color="A9CBB4"/>
+        </w:tblBorders>
+        <w:tblCellMar>
+          <w:top w:w="60" w:type="dxa"/>
+          <w:bottom w:w="60" w:type="dxa"/>
+          <w:left w:w="110" w:type="dxa"/>
+          <w:right w:w="110" w:type="dxa"/>
+        </w:tblCellMar>
       </w:tblPr>
       <w:tblGrid>
         <w:gridCol w:w="4014"/>
@@ -1827,15 +2185,21 @@
         <w:tc>
           <w:tcPr>
             <w:tcW w:w="4014" w:type="dxa"/>
-            <w:shd w:val="clear" w:color="auto" w:fill="F2F2F2"/>
-          </w:tcPr>
-          <w:p>
-            <w:pPr>
-              <w:bidi/>
-            </w:pPr>
-            <w:r>
-              <w:rPr>
-                <w:rtl/>
+            <w:shd w:val="clear" w:color="auto" w:fill="1F5132"/>
+          </w:tcPr>
+          <w:p>
+            <w:pPr>
+              <w:bidi/>
+              <w:spacing w:after="40" w:line="264" w:lineRule="auto"/>
+            </w:pPr>
+            <w:r>
+              <w:rPr>
+                <w:rFonts w:ascii="B Nazanin" w:hAnsi="B Nazanin" w:cs="B Nazanin" w:eastAsia="B Nazanin"/>
+                <w:rtl/>
+                <w:sz w:val="24"/>
+                <w:szCs w:val="24"/>
+                <w:b/>
+                <w:color w:val="FFFFFF"/>
               </w:rPr>
               <w:t xml:space="preserve">بند</w:t>
             </w:r>
@@ -1844,15 +2208,21 @@
         <w:tc>
           <w:tcPr>
             <w:tcW w:w="5345" w:type="dxa"/>
-            <w:shd w:val="clear" w:color="auto" w:fill="F2F2F2"/>
-          </w:tcPr>
-          <w:p>
-            <w:pPr>
-              <w:bidi/>
-            </w:pPr>
-            <w:r>
-              <w:rPr>
-                <w:rtl/>
+            <w:shd w:val="clear" w:color="auto" w:fill="1F5132"/>
+          </w:tcPr>
+          <w:p>
+            <w:pPr>
+              <w:bidi/>
+              <w:spacing w:after="40" w:line="264" w:lineRule="auto"/>
+            </w:pPr>
+            <w:r>
+              <w:rPr>
+                <w:rFonts w:ascii="B Nazanin" w:hAnsi="B Nazanin" w:cs="B Nazanin" w:eastAsia="B Nazanin"/>
+                <w:rtl/>
+                <w:sz w:val="24"/>
+                <w:szCs w:val="24"/>
+                <w:b/>
+                <w:color w:val="FFFFFF"/>
               </w:rPr>
               <w:t xml:space="preserve">حداقل محتوا</w:t>
             </w:r>
@@ -1863,14 +2233,19 @@
         <w:tc>
           <w:tcPr>
             <w:tcW w:w="4014" w:type="dxa"/>
-          </w:tcPr>
-          <w:p>
-            <w:pPr>
-              <w:bidi/>
-            </w:pPr>
-            <w:r>
-              <w:rPr>
-                <w:rtl/>
+            <w:shd w:val="clear" w:color="auto" w:fill="FFFFFF"/>
+          </w:tcPr>
+          <w:p>
+            <w:pPr>
+              <w:bidi/>
+              <w:spacing w:after="40" w:line="264" w:lineRule="auto"/>
+            </w:pPr>
+            <w:r>
+              <w:rPr>
+                <w:rFonts w:ascii="B Nazanin" w:hAnsi="B Nazanin" w:cs="B Nazanin" w:eastAsia="B Nazanin"/>
+                <w:rtl/>
+                <w:sz w:val="24"/>
+                <w:szCs w:val="24"/>
               </w:rPr>
               <w:t xml:space="preserve">مشخصات کالا</w:t>
             </w:r>
@@ -1879,14 +2254,19 @@
         <w:tc>
           <w:tcPr>
             <w:tcW w:w="5345" w:type="dxa"/>
-          </w:tcPr>
-          <w:p>
-            <w:pPr>
-              <w:bidi/>
-            </w:pPr>
-            <w:r>
-              <w:rPr>
-                <w:rtl/>
+            <w:shd w:val="clear" w:color="auto" w:fill="FFFFFF"/>
+          </w:tcPr>
+          <w:p>
+            <w:pPr>
+              <w:bidi/>
+              <w:spacing w:after="40" w:line="264" w:lineRule="auto"/>
+            </w:pPr>
+            <w:r>
+              <w:rPr>
+                <w:rFonts w:ascii="B Nazanin" w:hAnsi="B Nazanin" w:cs="B Nazanin" w:eastAsia="B Nazanin"/>
+                <w:rtl/>
+                <w:sz w:val="24"/>
+                <w:szCs w:val="24"/>
               </w:rPr>
               <w:t xml:space="preserve">نوع و واریته، سال برداشت، شکسته حداکثر ۵٪، رطوبت حداکثر ۱۴٪، مواد خارجی، باقیماند سموم و فلزات سنگین در حد استاندارد ملی</w:t>
             </w:r>
@@ -1897,14 +2277,19 @@
         <w:tc>
           <w:tcPr>
             <w:tcW w:w="4014" w:type="dxa"/>
-          </w:tcPr>
-          <w:p>
-            <w:pPr>
-              <w:bidi/>
-            </w:pPr>
-            <w:r>
-              <w:rPr>
-                <w:rtl/>
+            <w:shd w:val="clear" w:color="auto" w:fill="EEF6F0"/>
+          </w:tcPr>
+          <w:p>
+            <w:pPr>
+              <w:bidi/>
+              <w:spacing w:after="40" w:line="264" w:lineRule="auto"/>
+            </w:pPr>
+            <w:r>
+              <w:rPr>
+                <w:rFonts w:ascii="B Nazanin" w:hAnsi="B Nazanin" w:cs="B Nazanin" w:eastAsia="B Nazanin"/>
+                <w:rtl/>
+                <w:sz w:val="24"/>
+                <w:szCs w:val="24"/>
               </w:rPr>
               <w:t xml:space="preserve">مقدار و تلرانس</w:t>
             </w:r>
@@ -1913,14 +2298,19 @@
         <w:tc>
           <w:tcPr>
             <w:tcW w:w="5345" w:type="dxa"/>
-          </w:tcPr>
-          <w:p>
-            <w:pPr>
-              <w:bidi/>
-            </w:pPr>
-            <w:r>
-              <w:rPr>
-                <w:rtl/>
+            <w:shd w:val="clear" w:color="auto" w:fill="EEF6F0"/>
+          </w:tcPr>
+          <w:p>
+            <w:pPr>
+              <w:bidi/>
+              <w:spacing w:after="40" w:line="264" w:lineRule="auto"/>
+            </w:pPr>
+            <w:r>
+              <w:rPr>
+                <w:rFonts w:ascii="B Nazanin" w:hAnsi="B Nazanin" w:cs="B Nazanin" w:eastAsia="B Nazanin"/>
+                <w:rtl/>
+                <w:sz w:val="24"/>
+                <w:szCs w:val="24"/>
               </w:rPr>
               <w:t xml:space="preserve">وزن به تن متریک، تلرانس ±۵٪ به اختیار خریدار</w:t>
             </w:r>
@@ -1931,14 +2321,19 @@
         <w:tc>
           <w:tcPr>
             <w:tcW w:w="4014" w:type="dxa"/>
-          </w:tcPr>
-          <w:p>
-            <w:pPr>
-              <w:bidi/>
-            </w:pPr>
-            <w:r>
-              <w:rPr>
-                <w:rtl/>
+            <w:shd w:val="clear" w:color="auto" w:fill="FFFFFF"/>
+          </w:tcPr>
+          <w:p>
+            <w:pPr>
+              <w:bidi/>
+              <w:spacing w:after="40" w:line="264" w:lineRule="auto"/>
+            </w:pPr>
+            <w:r>
+              <w:rPr>
+                <w:rFonts w:ascii="B Nazanin" w:hAnsi="B Nazanin" w:cs="B Nazanin" w:eastAsia="B Nazanin"/>
+                <w:rtl/>
+                <w:sz w:val="24"/>
+                <w:szCs w:val="24"/>
               </w:rPr>
               <w:t xml:space="preserve">قیمت و اینکوترمز</w:t>
             </w:r>
@@ -1947,14 +2342,19 @@
         <w:tc>
           <w:tcPr>
             <w:tcW w:w="5345" w:type="dxa"/>
-          </w:tcPr>
-          <w:p>
-            <w:pPr>
-              <w:bidi/>
-            </w:pPr>
-            <w:r>
-              <w:rPr>
-                <w:rtl/>
+            <w:shd w:val="clear" w:color="auto" w:fill="FFFFFF"/>
+          </w:tcPr>
+          <w:p>
+            <w:pPr>
+              <w:bidi/>
+              <w:spacing w:after="40" w:line="264" w:lineRule="auto"/>
+            </w:pPr>
+            <w:r>
+              <w:rPr>
+                <w:rFonts w:ascii="B Nazanin" w:hAnsi="B Nazanin" w:cs="B Nazanin" w:eastAsia="B Nazanin"/>
+                <w:rtl/>
+                <w:sz w:val="24"/>
+                <w:szCs w:val="24"/>
               </w:rPr>
               <w:t xml:space="preserve">قیمت هر تن به ارز مشخص با شرط تحویل Incoterms 2020 و بندر مشخص</w:t>
             </w:r>
@@ -1965,14 +2365,19 @@
         <w:tc>
           <w:tcPr>
             <w:tcW w:w="4014" w:type="dxa"/>
-          </w:tcPr>
-          <w:p>
-            <w:pPr>
-              <w:bidi/>
-            </w:pPr>
-            <w:r>
-              <w:rPr>
-                <w:rtl/>
+            <w:shd w:val="clear" w:color="auto" w:fill="EEF6F0"/>
+          </w:tcPr>
+          <w:p>
+            <w:pPr>
+              <w:bidi/>
+              <w:spacing w:after="40" w:line="264" w:lineRule="auto"/>
+            </w:pPr>
+            <w:r>
+              <w:rPr>
+                <w:rFonts w:ascii="B Nazanin" w:hAnsi="B Nazanin" w:cs="B Nazanin" w:eastAsia="B Nazanin"/>
+                <w:rtl/>
+                <w:sz w:val="24"/>
+                <w:szCs w:val="24"/>
               </w:rPr>
               <w:t xml:space="preserve">بسته‌بندی و برچسب</w:t>
             </w:r>
@@ -1981,14 +2386,19 @@
         <w:tc>
           <w:tcPr>
             <w:tcW w:w="5345" w:type="dxa"/>
-          </w:tcPr>
-          <w:p>
-            <w:pPr>
-              <w:bidi/>
-            </w:pPr>
-            <w:r>
-              <w:rPr>
-                <w:rtl/>
+            <w:shd w:val="clear" w:color="auto" w:fill="EEF6F0"/>
+          </w:tcPr>
+          <w:p>
+            <w:pPr>
+              <w:bidi/>
+              <w:spacing w:after="40" w:line="264" w:lineRule="auto"/>
+            </w:pPr>
+            <w:r>
+              <w:rPr>
+                <w:rFonts w:ascii="B Nazanin" w:hAnsi="B Nazanin" w:cs="B Nazanin" w:eastAsia="B Nazanin"/>
+                <w:rtl/>
+                <w:sz w:val="24"/>
+                <w:szCs w:val="24"/>
               </w:rPr>
               <w:t xml:space="preserve">نوع کیسه، وزن هر کیسه، برچسب فارسی مطابق مقررات غذا و دارو</w:t>
             </w:r>
@@ -1999,14 +2409,19 @@
         <w:tc>
           <w:tcPr>
             <w:tcW w:w="4014" w:type="dxa"/>
-          </w:tcPr>
-          <w:p>
-            <w:pPr>
-              <w:bidi/>
-            </w:pPr>
-            <w:r>
-              <w:rPr>
-                <w:rtl/>
+            <w:shd w:val="clear" w:color="auto" w:fill="FFFFFF"/>
+          </w:tcPr>
+          <w:p>
+            <w:pPr>
+              <w:bidi/>
+              <w:spacing w:after="40" w:line="264" w:lineRule="auto"/>
+            </w:pPr>
+            <w:r>
+              <w:rPr>
+                <w:rFonts w:ascii="B Nazanin" w:hAnsi="B Nazanin" w:cs="B Nazanin" w:eastAsia="B Nazanin"/>
+                <w:rtl/>
+                <w:sz w:val="24"/>
+                <w:szCs w:val="24"/>
               </w:rPr>
               <w:t xml:space="preserve">زمان حمل</w:t>
             </w:r>
@@ -2015,14 +2430,19 @@
         <w:tc>
           <w:tcPr>
             <w:tcW w:w="5345" w:type="dxa"/>
-          </w:tcPr>
-          <w:p>
-            <w:pPr>
-              <w:bidi/>
-            </w:pPr>
-            <w:r>
-              <w:rPr>
-                <w:rtl/>
+            <w:shd w:val="clear" w:color="auto" w:fill="FFFFFF"/>
+          </w:tcPr>
+          <w:p>
+            <w:pPr>
+              <w:bidi/>
+              <w:spacing w:after="40" w:line="264" w:lineRule="auto"/>
+            </w:pPr>
+            <w:r>
+              <w:rPr>
+                <w:rFonts w:ascii="B Nazanin" w:hAnsi="B Nazanin" w:cs="B Nazanin" w:eastAsia="B Nazanin"/>
+                <w:rtl/>
+                <w:sz w:val="24"/>
+                <w:szCs w:val="24"/>
               </w:rPr>
               <w:t xml:space="preserve">بازه بارگیری و جریمه تأخیر ۰٫۵٪ در هفته تا سقف ۵٪</w:t>
             </w:r>
@@ -2033,14 +2453,19 @@
         <w:tc>
           <w:tcPr>
             <w:tcW w:w="4014" w:type="dxa"/>
-          </w:tcPr>
-          <w:p>
-            <w:pPr>
-              <w:bidi/>
-            </w:pPr>
-            <w:r>
-              <w:rPr>
-                <w:rtl/>
+            <w:shd w:val="clear" w:color="auto" w:fill="EEF6F0"/>
+          </w:tcPr>
+          <w:p>
+            <w:pPr>
+              <w:bidi/>
+              <w:spacing w:after="40" w:line="264" w:lineRule="auto"/>
+            </w:pPr>
+            <w:r>
+              <w:rPr>
+                <w:rFonts w:ascii="B Nazanin" w:hAnsi="B Nazanin" w:cs="B Nazanin" w:eastAsia="B Nazanin"/>
+                <w:rtl/>
+                <w:sz w:val="24"/>
+                <w:szCs w:val="24"/>
               </w:rPr>
               <w:t xml:space="preserve">بازرسی و مرجوعی</w:t>
             </w:r>
@@ -2049,14 +2474,19 @@
         <w:tc>
           <w:tcPr>
             <w:tcW w:w="5345" w:type="dxa"/>
-          </w:tcPr>
-          <w:p>
-            <w:pPr>
-              <w:bidi/>
-            </w:pPr>
-            <w:r>
-              <w:rPr>
-                <w:rtl/>
+            <w:shd w:val="clear" w:color="auto" w:fill="EEF6F0"/>
+          </w:tcPr>
+          <w:p>
+            <w:pPr>
+              <w:bidi/>
+              <w:spacing w:after="40" w:line="264" w:lineRule="auto"/>
+            </w:pPr>
+            <w:r>
+              <w:rPr>
+                <w:rFonts w:ascii="B Nazanin" w:hAnsi="B Nazanin" w:cs="B Nazanin" w:eastAsia="B Nazanin"/>
+                <w:rtl/>
+                <w:sz w:val="24"/>
+                <w:szCs w:val="24"/>
               </w:rPr>
               <w:t xml:space="preserve">نتیجه بازرسی مقصد ملاک نهایی؛ هزینه مرجوعی کالای غیرمنطبق با فروشنده</w:t>
             </w:r>
@@ -2067,14 +2497,19 @@
         <w:tc>
           <w:tcPr>
             <w:tcW w:w="4014" w:type="dxa"/>
-          </w:tcPr>
-          <w:p>
-            <w:pPr>
-              <w:bidi/>
-            </w:pPr>
-            <w:r>
-              <w:rPr>
-                <w:rtl/>
+            <w:shd w:val="clear" w:color="auto" w:fill="FFFFFF"/>
+          </w:tcPr>
+          <w:p>
+            <w:pPr>
+              <w:bidi/>
+              <w:spacing w:after="40" w:line="264" w:lineRule="auto"/>
+            </w:pPr>
+            <w:r>
+              <w:rPr>
+                <w:rFonts w:ascii="B Nazanin" w:hAnsi="B Nazanin" w:cs="B Nazanin" w:eastAsia="B Nazanin"/>
+                <w:rtl/>
+                <w:sz w:val="24"/>
+                <w:szCs w:val="24"/>
               </w:rPr>
               <w:t xml:space="preserve">اسناد حمل</w:t>
             </w:r>
@@ -2083,14 +2518,19 @@
         <w:tc>
           <w:tcPr>
             <w:tcW w:w="5345" w:type="dxa"/>
-          </w:tcPr>
-          <w:p>
-            <w:pPr>
-              <w:bidi/>
-            </w:pPr>
-            <w:r>
-              <w:rPr>
-                <w:rtl/>
+            <w:shd w:val="clear" w:color="auto" w:fill="FFFFFF"/>
+          </w:tcPr>
+          <w:p>
+            <w:pPr>
+              <w:bidi/>
+              <w:spacing w:after="40" w:line="264" w:lineRule="auto"/>
+            </w:pPr>
+            <w:r>
+              <w:rPr>
+                <w:rFonts w:ascii="B Nazanin" w:hAnsi="B Nazanin" w:cs="B Nazanin" w:eastAsia="B Nazanin"/>
+                <w:rtl/>
+                <w:sz w:val="24"/>
+                <w:szCs w:val="24"/>
               </w:rPr>
               <w:t xml:space="preserve">بارنامه، فاکتور تجاری، گواهی مبدأ، گواهی بهداشت گیاهی (Phytosanitary)، گواهی بازرسی، فهرست عدل‌بندی، گواهی فومیگاسیون</w:t>
             </w:r>
@@ -2101,14 +2541,19 @@
         <w:tc>
           <w:tcPr>
             <w:tcW w:w="4014" w:type="dxa"/>
-          </w:tcPr>
-          <w:p>
-            <w:pPr>
-              <w:bidi/>
-            </w:pPr>
-            <w:r>
-              <w:rPr>
-                <w:rtl/>
+            <w:shd w:val="clear" w:color="auto" w:fill="EEF6F0"/>
+          </w:tcPr>
+          <w:p>
+            <w:pPr>
+              <w:bidi/>
+              <w:spacing w:after="40" w:line="264" w:lineRule="auto"/>
+            </w:pPr>
+            <w:r>
+              <w:rPr>
+                <w:rFonts w:ascii="B Nazanin" w:hAnsi="B Nazanin" w:cs="B Nazanin" w:eastAsia="B Nazanin"/>
+                <w:rtl/>
+                <w:sz w:val="24"/>
+                <w:szCs w:val="24"/>
               </w:rPr>
               <w:t xml:space="preserve">فورس‌ماژور و تحریم</w:t>
             </w:r>
@@ -2117,14 +2562,19 @@
         <w:tc>
           <w:tcPr>
             <w:tcW w:w="5345" w:type="dxa"/>
-          </w:tcPr>
-          <w:p>
-            <w:pPr>
-              <w:bidi/>
-            </w:pPr>
-            <w:r>
-              <w:rPr>
-                <w:rtl/>
+            <w:shd w:val="clear" w:color="auto" w:fill="EEF6F0"/>
+          </w:tcPr>
+          <w:p>
+            <w:pPr>
+              <w:bidi/>
+              <w:spacing w:after="40" w:line="264" w:lineRule="auto"/>
+            </w:pPr>
+            <w:r>
+              <w:rPr>
+                <w:rFonts w:ascii="B Nazanin" w:hAnsi="B Nazanin" w:cs="B Nazanin" w:eastAsia="B Nazanin"/>
+                <w:rtl/>
+                <w:sz w:val="24"/>
+                <w:szCs w:val="24"/>
               </w:rPr>
               <w:t xml:space="preserve">تعریف رویداد قهری، بند تغییر مسیر پرداخت در صورت محدودیت بانکی</w:t>
             </w:r>
@@ -2135,14 +2585,19 @@
         <w:tc>
           <w:tcPr>
             <w:tcW w:w="4014" w:type="dxa"/>
-          </w:tcPr>
-          <w:p>
-            <w:pPr>
-              <w:bidi/>
-            </w:pPr>
-            <w:r>
-              <w:rPr>
-                <w:rtl/>
+            <w:shd w:val="clear" w:color="auto" w:fill="FFFFFF"/>
+          </w:tcPr>
+          <w:p>
+            <w:pPr>
+              <w:bidi/>
+              <w:spacing w:after="40" w:line="264" w:lineRule="auto"/>
+            </w:pPr>
+            <w:r>
+              <w:rPr>
+                <w:rFonts w:ascii="B Nazanin" w:hAnsi="B Nazanin" w:cs="B Nazanin" w:eastAsia="B Nazanin"/>
+                <w:rtl/>
+                <w:sz w:val="24"/>
+                <w:szCs w:val="24"/>
               </w:rPr>
               <w:t xml:space="preserve">حل اختلاف</w:t>
             </w:r>
@@ -2151,14 +2606,19 @@
         <w:tc>
           <w:tcPr>
             <w:tcW w:w="5345" w:type="dxa"/>
-          </w:tcPr>
-          <w:p>
-            <w:pPr>
-              <w:bidi/>
-            </w:pPr>
-            <w:r>
-              <w:rPr>
-                <w:rtl/>
+            <w:shd w:val="clear" w:color="auto" w:fill="FFFFFF"/>
+          </w:tcPr>
+          <w:p>
+            <w:pPr>
+              <w:bidi/>
+              <w:spacing w:after="40" w:line="264" w:lineRule="auto"/>
+            </w:pPr>
+            <w:r>
+              <w:rPr>
+                <w:rFonts w:ascii="B Nazanin" w:hAnsi="B Nazanin" w:cs="B Nazanin" w:eastAsia="B Nazanin"/>
+                <w:rtl/>
+                <w:sz w:val="24"/>
+                <w:szCs w:val="24"/>
               </w:rPr>
               <w:t xml:space="preserve">داوری بین‌المللی (مثل GAFTA یا اتاق بازرگانی بین‌المللی) با محل و زبان مشخص</w:t>
             </w:r>
@@ -2173,6 +2633,7 @@
       </w:pPr>
       <w:r>
         <w:rPr>
+          <w:rFonts w:ascii="B Nazanin" w:hAnsi="B Nazanin" w:cs="B Nazanin" w:eastAsia="B Nazanin"/>
           <w:rtl/>
         </w:rPr>
         <w:t xml:space="preserve">فصل ششم: فروش و توزیع داخلی</w:t>
@@ -2184,6 +2645,7 @@
       </w:pPr>
       <w:r>
         <w:rPr>
+          <w:rFonts w:ascii="B Nazanin" w:hAnsi="B Nazanin" w:cs="B Nazanin" w:eastAsia="B Nazanin"/>
           <w:b/>
           <w:bCs/>
           <w:rtl/>
@@ -2192,6 +2654,7 @@
       </w:r>
       <w:r>
         <w:rPr>
+          <w:rFonts w:ascii="B Nazanin" w:hAnsi="B Nazanin" w:cs="B Nazanin" w:eastAsia="B Nazanin"/>
           <w:rtl/>
         </w:rPr>
         <w:t xml:space="preserve"> واحد بازرگانی برای هر محموله نرخ‌نامه را بر پایه قیمت تمام‌شده، حاشیه سود مصوب هیئت‌مدیران و قیمت‌گذاری مرجع رسمی (اگر باشد) تهیه می‌کند و مدیرعامل تصویب می‌کند. تخفیف بیش از ۳٪ نرخ‌نامه با تأیید مدیرعامل است.</w:t>
@@ -2203,6 +2666,7 @@
       </w:pPr>
       <w:r>
         <w:rPr>
+          <w:rFonts w:ascii="B Nazanin" w:hAnsi="B Nazanin" w:cs="B Nazanin" w:eastAsia="B Nazanin"/>
           <w:b/>
           <w:bCs/>
           <w:rtl/>
@@ -2221,6 +2685,7 @@
       </w:pPr>
       <w:r>
         <w:rPr>
+          <w:rFonts w:ascii="B Nazanin" w:hAnsi="B Nazanin" w:cs="B Nazanin" w:eastAsia="B Nazanin"/>
           <w:rtl/>
         </w:rPr>
         <w:t xml:space="preserve">فروش نقدی به مشتریان ثبت‌شده با نرخ‌نامه مصوب</w:t>
@@ -2237,6 +2702,7 @@
       </w:pPr>
       <w:r>
         <w:rPr>
+          <w:rFonts w:ascii="B Nazanin" w:hAnsi="B Nazanin" w:cs="B Nazanin" w:eastAsia="B Nazanin"/>
           <w:rtl/>
         </w:rPr>
         <w:t xml:space="preserve">عرضه در بورس کالا (اگر مقررات الزام کند یا شرکت تصمیم بگیرد)</w:t>
@@ -2253,6 +2719,7 @@
       </w:pPr>
       <w:r>
         <w:rPr>
+          <w:rFonts w:ascii="B Nazanin" w:hAnsi="B Nazanin" w:cs="B Nazanin" w:eastAsia="B Nazanin"/>
           <w:rtl/>
         </w:rPr>
         <w:t xml:space="preserve">قرارداد تأمین بلندمدت با فروشگاه‌های زنجیره‌ای یا صنایع غذایی، با تشریفات طبقه مبلغی ماده ۵</w:t>
@@ -2269,6 +2736,7 @@
       </w:pPr>
       <w:r>
         <w:rPr>
+          <w:rFonts w:ascii="B Nazanin" w:hAnsi="B Nazanin" w:cs="B Nazanin" w:eastAsia="B Nazanin"/>
           <w:rtl/>
         </w:rPr>
         <w:t xml:space="preserve">فروش از طریق نمایندگان رسمی با قرارداد کتبی و سهمیه منطقه‌ای</w:t>
@@ -2280,6 +2748,7 @@
       </w:pPr>
       <w:r>
         <w:rPr>
+          <w:rFonts w:ascii="B Nazanin" w:hAnsi="B Nazanin" w:cs="B Nazanin" w:eastAsia="B Nazanin"/>
           <w:b/>
           <w:bCs/>
           <w:rtl/>
@@ -2288,6 +2757,7 @@
       </w:r>
       <w:r>
         <w:rPr>
+          <w:rFonts w:ascii="B Nazanin" w:hAnsi="B Nazanin" w:cs="B Nazanin" w:eastAsia="B Nazanin"/>
           <w:rtl/>
         </w:rPr>
         <w:t xml:space="preserve"> فروش مدت‌دار تنها در سقف اعتبار هر مشتری مجاز است. سقف را مدیر مالی بر پایه سابقه پرداخت و وثیقه تعیین می‌کند:</w:t>
@@ -2304,6 +2774,7 @@
       </w:pPr>
       <w:r>
         <w:rPr>
+          <w:rFonts w:ascii="B Nazanin" w:hAnsi="B Nazanin" w:cs="B Nazanin" w:eastAsia="B Nazanin"/>
           <w:rtl/>
         </w:rPr>
         <w:t xml:space="preserve">وثیقه معتبر حداقل برابر با سقف اعتبار (ضمانت‌نامه بانکی، چک صیادی ثبت‌شده، سفته یا وثیقه ملکی)</w:t>
@@ -2320,6 +2791,7 @@
       </w:pPr>
       <w:r>
         <w:rPr>
+          <w:rFonts w:ascii="B Nazanin" w:hAnsi="B Nazanin" w:cs="B Nazanin" w:eastAsia="B Nazanin"/>
           <w:rtl/>
         </w:rPr>
         <w:t xml:space="preserve">حداکثر مدت بازپرداخت ۶۰ روز</w:t>
@@ -2336,6 +2808,7 @@
       </w:pPr>
       <w:r>
         <w:rPr>
+          <w:rFonts w:ascii="B Nazanin" w:hAnsi="B Nazanin" w:cs="B Nazanin" w:eastAsia="B Nazanin"/>
           <w:rtl/>
         </w:rPr>
         <w:t xml:space="preserve">توقف فروش جدید به مشتری دارای بدهی سررسیدگذشته بیش از ۱۵ روز</w:t>
@@ -2347,6 +2820,7 @@
       </w:pPr>
       <w:r>
         <w:rPr>
+          <w:rFonts w:ascii="B Nazanin" w:hAnsi="B Nazanin" w:cs="B Nazanin" w:eastAsia="B Nazanin"/>
           <w:b/>
           <w:bCs/>
           <w:rtl/>
@@ -2355,6 +2829,7 @@
       </w:r>
       <w:r>
         <w:rPr>
+          <w:rFonts w:ascii="B Nazanin" w:hAnsi="B Nazanin" w:cs="B Nazanin" w:eastAsia="B Nazanin"/>
           <w:rtl/>
         </w:rPr>
         <w:t xml:space="preserve"> هر فروش با فاکتور رسمی و ثبت در سامانه مؤدیان مالیاتی، حواله خروج انبار و بارنامه حمل انجام می‌شود. خروج کالا پیش از تأیید واحد مالی بر دریافت وجه یا وثیقه ممنوع است.</w:t>
@@ -2366,6 +2841,7 @@
       </w:pPr>
       <w:r>
         <w:rPr>
+          <w:rFonts w:ascii="B Nazanin" w:hAnsi="B Nazanin" w:cs="B Nazanin" w:eastAsia="B Nazanin"/>
           <w:b/>
           <w:bCs/>
           <w:rtl/>
@@ -2374,6 +2850,7 @@
       </w:r>
       <w:r>
         <w:rPr>
+          <w:rFonts w:ascii="B Nazanin" w:hAnsi="B Nazanin" w:cs="B Nazanin" w:eastAsia="B Nazanin"/>
           <w:rtl/>
         </w:rPr>
         <w:t xml:space="preserve"> انبارگردانی فیزیکی هر سه ماه یک بار انجام می‌شود. افت وزن بیش از ۰٫۵٪ یا آفت‌زدگی، گزارش فوری به مدیرعامل و حسابرس داخلی لازم دارد. خروج کالا به روش اولین وارد، اولین صادر (FIFO) و با توجه به تاریخ انقضا است.</w:t>
@@ -2386,6 +2863,7 @@
       </w:pPr>
       <w:r>
         <w:rPr>
+          <w:rFonts w:ascii="B Nazanin" w:hAnsi="B Nazanin" w:cs="B Nazanin" w:eastAsia="B Nazanin"/>
           <w:rtl/>
         </w:rPr>
         <w:t xml:space="preserve">فصل هفتم: تضمین‌ها، پرداخت‌ها و مدیریت ریسک</w:t>
@@ -2397,6 +2875,7 @@
       </w:pPr>
       <w:r>
         <w:rPr>
+          <w:rFonts w:ascii="B Nazanin" w:hAnsi="B Nazanin" w:cs="B Nazanin" w:eastAsia="B Nazanin"/>
           <w:b/>
           <w:bCs/>
           <w:rtl/>
@@ -2406,11 +2885,25 @@
     </w:p>
     <w:tbl>
       <w:tblPr>
-        <w:bidiVisual/>
         <w:tblStyle w:val="TableGrid"/>
         <w:tblW w:w="0" w:type="auto"/>
+        <w:jc w:val="center"/>
         <w:tblLayout w:type="fixed"/>
         <w:tblLook w:val="04A0" w:firstRow="1" w:lastRow="0" w:firstColumn="0" w:lastColumn="0" w:noHBand="0" w:noVBand="1"/>
+        <w:tblBorders>
+          <w:top w:val="single" w:sz="4" w:space="0" w:color="A9CBB4"/>
+          <w:left w:val="single" w:sz="4" w:space="0" w:color="A9CBB4"/>
+          <w:bottom w:val="single" w:sz="4" w:space="0" w:color="A9CBB4"/>
+          <w:right w:val="single" w:sz="4" w:space="0" w:color="A9CBB4"/>
+          <w:insideH w:val="single" w:sz="4" w:space="0" w:color="A9CBB4"/>
+          <w:insideV w:val="single" w:sz="4" w:space="0" w:color="A9CBB4"/>
+        </w:tblBorders>
+        <w:tblCellMar>
+          <w:top w:w="60" w:type="dxa"/>
+          <w:bottom w:w="60" w:type="dxa"/>
+          <w:left w:w="110" w:type="dxa"/>
+          <w:right w:w="110" w:type="dxa"/>
+        </w:tblCellMar>
       </w:tblPr>
       <w:tblGrid>
         <w:gridCol w:w="2714"/>
@@ -2424,15 +2917,21 @@
         <w:tc>
           <w:tcPr>
             <w:tcW w:w="2714" w:type="dxa"/>
-            <w:shd w:val="clear" w:color="auto" w:fill="F2F2F2"/>
-          </w:tcPr>
-          <w:p>
-            <w:pPr>
-              <w:bidi/>
-            </w:pPr>
-            <w:r>
-              <w:rPr>
-                <w:rtl/>
+            <w:shd w:val="clear" w:color="auto" w:fill="1F5132"/>
+          </w:tcPr>
+          <w:p>
+            <w:pPr>
+              <w:bidi/>
+              <w:spacing w:after="40" w:line="264" w:lineRule="auto"/>
+            </w:pPr>
+            <w:r>
+              <w:rPr>
+                <w:rFonts w:ascii="B Nazanin" w:hAnsi="B Nazanin" w:cs="B Nazanin" w:eastAsia="B Nazanin"/>
+                <w:rtl/>
+                <w:sz w:val="24"/>
+                <w:szCs w:val="24"/>
+                <w:b/>
+                <w:color w:val="FFFFFF"/>
               </w:rPr>
               <w:t xml:space="preserve">تضمین</w:t>
             </w:r>
@@ -2441,15 +2940,21 @@
         <w:tc>
           <w:tcPr>
             <w:tcW w:w="2261" w:type="dxa"/>
-            <w:shd w:val="clear" w:color="auto" w:fill="F2F2F2"/>
-          </w:tcPr>
-          <w:p>
-            <w:pPr>
-              <w:bidi/>
-            </w:pPr>
-            <w:r>
-              <w:rPr>
-                <w:rtl/>
+            <w:shd w:val="clear" w:color="auto" w:fill="1F5132"/>
+          </w:tcPr>
+          <w:p>
+            <w:pPr>
+              <w:bidi/>
+              <w:spacing w:after="40" w:line="264" w:lineRule="auto"/>
+            </w:pPr>
+            <w:r>
+              <w:rPr>
+                <w:rFonts w:ascii="B Nazanin" w:hAnsi="B Nazanin" w:cs="B Nazanin" w:eastAsia="B Nazanin"/>
+                <w:rtl/>
+                <w:sz w:val="24"/>
+                <w:szCs w:val="24"/>
+                <w:b/>
+                <w:color w:val="FFFFFF"/>
               </w:rPr>
               <w:t xml:space="preserve">مبلغ</w:t>
             </w:r>
@@ -2458,15 +2963,21 @@
         <w:tc>
           <w:tcPr>
             <w:tcW w:w="4384" w:type="dxa"/>
-            <w:shd w:val="clear" w:color="auto" w:fill="F2F2F2"/>
-          </w:tcPr>
-          <w:p>
-            <w:pPr>
-              <w:bidi/>
-            </w:pPr>
-            <w:r>
-              <w:rPr>
-                <w:rtl/>
+            <w:shd w:val="clear" w:color="auto" w:fill="1F5132"/>
+          </w:tcPr>
+          <w:p>
+            <w:pPr>
+              <w:bidi/>
+              <w:spacing w:after="40" w:line="264" w:lineRule="auto"/>
+            </w:pPr>
+            <w:r>
+              <w:rPr>
+                <w:rFonts w:ascii="B Nazanin" w:hAnsi="B Nazanin" w:cs="B Nazanin" w:eastAsia="B Nazanin"/>
+                <w:rtl/>
+                <w:sz w:val="24"/>
+                <w:szCs w:val="24"/>
+                <w:b/>
+                <w:color w:val="FFFFFF"/>
               </w:rPr>
               <w:t xml:space="preserve">زمان آزادسازی</w:t>
             </w:r>
@@ -2477,14 +2988,19 @@
         <w:tc>
           <w:tcPr>
             <w:tcW w:w="2714" w:type="dxa"/>
-          </w:tcPr>
-          <w:p>
-            <w:pPr>
-              <w:bidi/>
-            </w:pPr>
-            <w:r>
-              <w:rPr>
-                <w:rtl/>
+            <w:shd w:val="clear" w:color="auto" w:fill="FFFFFF"/>
+          </w:tcPr>
+          <w:p>
+            <w:pPr>
+              <w:bidi/>
+              <w:spacing w:after="40" w:line="264" w:lineRule="auto"/>
+            </w:pPr>
+            <w:r>
+              <w:rPr>
+                <w:rFonts w:ascii="B Nazanin" w:hAnsi="B Nazanin" w:cs="B Nazanin" w:eastAsia="B Nazanin"/>
+                <w:rtl/>
+                <w:sz w:val="24"/>
+                <w:szCs w:val="24"/>
               </w:rPr>
               <w:t xml:space="preserve">شرکت در مناقصه</w:t>
             </w:r>
@@ -2493,14 +3009,19 @@
         <w:tc>
           <w:tcPr>
             <w:tcW w:w="2261" w:type="dxa"/>
-          </w:tcPr>
-          <w:p>
-            <w:pPr>
-              <w:bidi/>
-            </w:pPr>
-            <w:r>
-              <w:rPr>
-                <w:rtl/>
+            <w:shd w:val="clear" w:color="auto" w:fill="FFFFFF"/>
+          </w:tcPr>
+          <w:p>
+            <w:pPr>
+              <w:bidi/>
+              <w:spacing w:after="40" w:line="264" w:lineRule="auto"/>
+            </w:pPr>
+            <w:r>
+              <w:rPr>
+                <w:rFonts w:ascii="B Nazanin" w:hAnsi="B Nazanin" w:cs="B Nazanin" w:eastAsia="B Nazanin"/>
+                <w:rtl/>
+                <w:sz w:val="24"/>
+                <w:szCs w:val="24"/>
               </w:rPr>
               <w:t xml:space="preserve">۵٪ برآورد</w:t>
             </w:r>
@@ -2509,14 +3030,19 @@
         <w:tc>
           <w:tcPr>
             <w:tcW w:w="4384" w:type="dxa"/>
-          </w:tcPr>
-          <w:p>
-            <w:pPr>
-              <w:bidi/>
-            </w:pPr>
-            <w:r>
-              <w:rPr>
-                <w:rtl/>
+            <w:shd w:val="clear" w:color="auto" w:fill="FFFFFF"/>
+          </w:tcPr>
+          <w:p>
+            <w:pPr>
+              <w:bidi/>
+              <w:spacing w:after="40" w:line="264" w:lineRule="auto"/>
+            </w:pPr>
+            <w:r>
+              <w:rPr>
+                <w:rFonts w:ascii="B Nazanin" w:hAnsi="B Nazanin" w:cs="B Nazanin" w:eastAsia="B Nazanin"/>
+                <w:rtl/>
+                <w:sz w:val="24"/>
+                <w:szCs w:val="24"/>
               </w:rPr>
               <w:t xml:space="preserve">پس از امضای قرارداد (برنده) یا اعلام نتیجه (سایرین)</w:t>
             </w:r>
@@ -2527,14 +3053,19 @@
         <w:tc>
           <w:tcPr>
             <w:tcW w:w="2714" w:type="dxa"/>
-          </w:tcPr>
-          <w:p>
-            <w:pPr>
-              <w:bidi/>
-            </w:pPr>
-            <w:r>
-              <w:rPr>
-                <w:rtl/>
+            <w:shd w:val="clear" w:color="auto" w:fill="EEF6F0"/>
+          </w:tcPr>
+          <w:p>
+            <w:pPr>
+              <w:bidi/>
+              <w:spacing w:after="40" w:line="264" w:lineRule="auto"/>
+            </w:pPr>
+            <w:r>
+              <w:rPr>
+                <w:rFonts w:ascii="B Nazanin" w:hAnsi="B Nazanin" w:cs="B Nazanin" w:eastAsia="B Nazanin"/>
+                <w:rtl/>
+                <w:sz w:val="24"/>
+                <w:szCs w:val="24"/>
               </w:rPr>
               <w:t xml:space="preserve">حسن انجام تعهدات</w:t>
             </w:r>
@@ -2543,14 +3074,19 @@
         <w:tc>
           <w:tcPr>
             <w:tcW w:w="2261" w:type="dxa"/>
-          </w:tcPr>
-          <w:p>
-            <w:pPr>
-              <w:bidi/>
-            </w:pPr>
-            <w:r>
-              <w:rPr>
-                <w:rtl/>
+            <w:shd w:val="clear" w:color="auto" w:fill="EEF6F0"/>
+          </w:tcPr>
+          <w:p>
+            <w:pPr>
+              <w:bidi/>
+              <w:spacing w:after="40" w:line="264" w:lineRule="auto"/>
+            </w:pPr>
+            <w:r>
+              <w:rPr>
+                <w:rFonts w:ascii="B Nazanin" w:hAnsi="B Nazanin" w:cs="B Nazanin" w:eastAsia="B Nazanin"/>
+                <w:rtl/>
+                <w:sz w:val="24"/>
+                <w:szCs w:val="24"/>
               </w:rPr>
               <w:t xml:space="preserve">۱۰٪ مبلغ قرارداد</w:t>
             </w:r>
@@ -2559,14 +3095,19 @@
         <w:tc>
           <w:tcPr>
             <w:tcW w:w="4384" w:type="dxa"/>
-          </w:tcPr>
-          <w:p>
-            <w:pPr>
-              <w:bidi/>
-            </w:pPr>
-            <w:r>
-              <w:rPr>
-                <w:rtl/>
+            <w:shd w:val="clear" w:color="auto" w:fill="EEF6F0"/>
+          </w:tcPr>
+          <w:p>
+            <w:pPr>
+              <w:bidi/>
+              <w:spacing w:after="40" w:line="264" w:lineRule="auto"/>
+            </w:pPr>
+            <w:r>
+              <w:rPr>
+                <w:rFonts w:ascii="B Nazanin" w:hAnsi="B Nazanin" w:cs="B Nazanin" w:eastAsia="B Nazanin"/>
+                <w:rtl/>
+                <w:sz w:val="24"/>
+                <w:szCs w:val="24"/>
               </w:rPr>
               <w:t xml:space="preserve">پس از تحویل نهایی و تأیید کیفیت</w:t>
             </w:r>
@@ -2577,14 +3118,19 @@
         <w:tc>
           <w:tcPr>
             <w:tcW w:w="2714" w:type="dxa"/>
-          </w:tcPr>
-          <w:p>
-            <w:pPr>
-              <w:bidi/>
-            </w:pPr>
-            <w:r>
-              <w:rPr>
-                <w:rtl/>
+            <w:shd w:val="clear" w:color="auto" w:fill="FFFFFF"/>
+          </w:tcPr>
+          <w:p>
+            <w:pPr>
+              <w:bidi/>
+              <w:spacing w:after="40" w:line="264" w:lineRule="auto"/>
+            </w:pPr>
+            <w:r>
+              <w:rPr>
+                <w:rFonts w:ascii="B Nazanin" w:hAnsi="B Nazanin" w:cs="B Nazanin" w:eastAsia="B Nazanin"/>
+                <w:rtl/>
+                <w:sz w:val="24"/>
+                <w:szCs w:val="24"/>
               </w:rPr>
               <w:t xml:space="preserve">بازپرداخت پیش‌پرداخت</w:t>
             </w:r>
@@ -2593,14 +3139,19 @@
         <w:tc>
           <w:tcPr>
             <w:tcW w:w="2261" w:type="dxa"/>
-          </w:tcPr>
-          <w:p>
-            <w:pPr>
-              <w:bidi/>
-            </w:pPr>
-            <w:r>
-              <w:rPr>
-                <w:rtl/>
+            <w:shd w:val="clear" w:color="auto" w:fill="FFFFFF"/>
+          </w:tcPr>
+          <w:p>
+            <w:pPr>
+              <w:bidi/>
+              <w:spacing w:after="40" w:line="264" w:lineRule="auto"/>
+            </w:pPr>
+            <w:r>
+              <w:rPr>
+                <w:rFonts w:ascii="B Nazanin" w:hAnsi="B Nazanin" w:cs="B Nazanin" w:eastAsia="B Nazanin"/>
+                <w:rtl/>
+                <w:sz w:val="24"/>
+                <w:szCs w:val="24"/>
               </w:rPr>
               <w:t xml:space="preserve">۱۰۰٪ پیش‌پرداخت</w:t>
             </w:r>
@@ -2609,14 +3160,19 @@
         <w:tc>
           <w:tcPr>
             <w:tcW w:w="4384" w:type="dxa"/>
-          </w:tcPr>
-          <w:p>
-            <w:pPr>
-              <w:bidi/>
-            </w:pPr>
-            <w:r>
-              <w:rPr>
-                <w:rtl/>
+            <w:shd w:val="clear" w:color="auto" w:fill="FFFFFF"/>
+          </w:tcPr>
+          <w:p>
+            <w:pPr>
+              <w:bidi/>
+              <w:spacing w:after="40" w:line="264" w:lineRule="auto"/>
+            </w:pPr>
+            <w:r>
+              <w:rPr>
+                <w:rFonts w:ascii="B Nazanin" w:hAnsi="B Nazanin" w:cs="B Nazanin" w:eastAsia="B Nazanin"/>
+                <w:rtl/>
+                <w:sz w:val="24"/>
+                <w:szCs w:val="24"/>
               </w:rPr>
               <w:t xml:space="preserve">به نسبت تحویل کالا</w:t>
             </w:r>
@@ -2627,14 +3183,19 @@
         <w:tc>
           <w:tcPr>
             <w:tcW w:w="2714" w:type="dxa"/>
-          </w:tcPr>
-          <w:p>
-            <w:pPr>
-              <w:bidi/>
-            </w:pPr>
-            <w:r>
-              <w:rPr>
-                <w:rtl/>
+            <w:shd w:val="clear" w:color="auto" w:fill="EEF6F0"/>
+          </w:tcPr>
+          <w:p>
+            <w:pPr>
+              <w:bidi/>
+              <w:spacing w:after="40" w:line="264" w:lineRule="auto"/>
+            </w:pPr>
+            <w:r>
+              <w:rPr>
+                <w:rFonts w:ascii="B Nazanin" w:hAnsi="B Nazanin" w:cs="B Nazanin" w:eastAsia="B Nazanin"/>
+                <w:rtl/>
+                <w:sz w:val="24"/>
+                <w:szCs w:val="24"/>
               </w:rPr>
               <w:t xml:space="preserve">وثیقه فروش اعتباری</w:t>
             </w:r>
@@ -2643,14 +3204,19 @@
         <w:tc>
           <w:tcPr>
             <w:tcW w:w="2261" w:type="dxa"/>
-          </w:tcPr>
-          <w:p>
-            <w:pPr>
-              <w:bidi/>
-            </w:pPr>
-            <w:r>
-              <w:rPr>
-                <w:rtl/>
+            <w:shd w:val="clear" w:color="auto" w:fill="EEF6F0"/>
+          </w:tcPr>
+          <w:p>
+            <w:pPr>
+              <w:bidi/>
+              <w:spacing w:after="40" w:line="264" w:lineRule="auto"/>
+            </w:pPr>
+            <w:r>
+              <w:rPr>
+                <w:rFonts w:ascii="B Nazanin" w:hAnsi="B Nazanin" w:cs="B Nazanin" w:eastAsia="B Nazanin"/>
+                <w:rtl/>
+                <w:sz w:val="24"/>
+                <w:szCs w:val="24"/>
               </w:rPr>
               <w:t xml:space="preserve">برابر سقف اعتبار</w:t>
             </w:r>
@@ -2659,14 +3225,19 @@
         <w:tc>
           <w:tcPr>
             <w:tcW w:w="4384" w:type="dxa"/>
-          </w:tcPr>
-          <w:p>
-            <w:pPr>
-              <w:bidi/>
-            </w:pPr>
-            <w:r>
-              <w:rPr>
-                <w:rtl/>
+            <w:shd w:val="clear" w:color="auto" w:fill="EEF6F0"/>
+          </w:tcPr>
+          <w:p>
+            <w:pPr>
+              <w:bidi/>
+              <w:spacing w:after="40" w:line="264" w:lineRule="auto"/>
+            </w:pPr>
+            <w:r>
+              <w:rPr>
+                <w:rFonts w:ascii="B Nazanin" w:hAnsi="B Nazanin" w:cs="B Nazanin" w:eastAsia="B Nazanin"/>
+                <w:rtl/>
+                <w:sz w:val="24"/>
+                <w:szCs w:val="24"/>
               </w:rPr>
               <w:t xml:space="preserve">پس از تسویه کامل</w:t>
             </w:r>
@@ -2680,6 +3251,7 @@
       </w:pPr>
       <w:r>
         <w:rPr>
+          <w:rFonts w:ascii="B Nazanin" w:hAnsi="B Nazanin" w:cs="B Nazanin" w:eastAsia="B Nazanin"/>
           <w:rtl/>
         </w:rPr>
         <w:t xml:space="preserve">تضمین خارجی به شکل ضمانت‌نامه بانکی (Bank Guarantee یا Standby LC) از بانک معتبر است. اسناد تضمین در امانت واحد مالی نگهداری و سررسید آن‌ها ماهانه پیگیری می‌شود.</w:t>
@@ -2691,6 +3263,7 @@
       </w:pPr>
       <w:r>
         <w:rPr>
+          <w:rFonts w:ascii="B Nazanin" w:hAnsi="B Nazanin" w:cs="B Nazanin" w:eastAsia="B Nazanin"/>
           <w:b/>
           <w:bCs/>
           <w:rtl/>
@@ -2699,6 +3272,7 @@
       </w:r>
       <w:r>
         <w:rPr>
+          <w:rFonts w:ascii="B Nazanin" w:hAnsi="B Nazanin" w:cs="B Nazanin" w:eastAsia="B Nazanin"/>
           <w:rtl/>
         </w:rPr>
         <w:t xml:space="preserve"> هر پرداخت با سه سند انجام می‌شود: سفارش/قرارداد مصوب، رسید انبار یا گواهی انجام خدمت، و فاکتور. متقاضی پرداخت و تأییدکننده آن نباید یک نفر باشند. پرداخت نقدی فقط تا سقف تنخواه مصوب مجاز است.</w:t>
@@ -2710,6 +3284,7 @@
       </w:pPr>
       <w:r>
         <w:rPr>
+          <w:rFonts w:ascii="B Nazanin" w:hAnsi="B Nazanin" w:cs="B Nazanin" w:eastAsia="B Nazanin"/>
           <w:b/>
           <w:bCs/>
           <w:rtl/>
@@ -2718,6 +3293,7 @@
       </w:r>
       <w:r>
         <w:rPr>
+          <w:rFonts w:ascii="B Nazanin" w:hAnsi="B Nazanin" w:cs="B Nazanin" w:eastAsia="B Nazanin"/>
           <w:rtl/>
         </w:rPr>
         <w:t xml:space="preserve"> فاصله زمانی امضای قرارداد خارجی تا تأمین ارز باید حداقل باشد. واحد مالی هر هفته وضعیت تعهدات ارزی باز و اثر تغییر نرخ بر قیمت تمام‌شده را به مدیرعامل گزارش می‌دهد.</w:t>
@@ -2729,6 +3305,7 @@
       </w:pPr>
       <w:r>
         <w:rPr>
+          <w:rFonts w:ascii="B Nazanin" w:hAnsi="B Nazanin" w:cs="B Nazanin" w:eastAsia="B Nazanin"/>
           <w:b/>
           <w:bCs/>
           <w:rtl/>
@@ -2747,6 +3324,7 @@
       </w:pPr>
       <w:r>
         <w:rPr>
+          <w:rFonts w:ascii="B Nazanin" w:hAnsi="B Nazanin" w:cs="B Nazanin" w:eastAsia="B Nazanin"/>
           <w:rtl/>
         </w:rPr>
         <w:t xml:space="preserve">حداکثر ۴۰٪ حجم واردات سالانه از یک تأمین‌کننده، و حداکثر ۶۰٪ از یک کشور</w:t>
@@ -2763,6 +3341,7 @@
       </w:pPr>
       <w:r>
         <w:rPr>
+          <w:rFonts w:ascii="B Nazanin" w:hAnsi="B Nazanin" w:cs="B Nazanin" w:eastAsia="B Nazanin"/>
           <w:rtl/>
         </w:rPr>
         <w:t xml:space="preserve">موجودی انبار بیش از ۶ ماه فروش پیش‌بینی‌شده با تصویب هیئت‌مدیران</w:t>
@@ -2779,6 +3358,7 @@
       </w:pPr>
       <w:r>
         <w:rPr>
+          <w:rFonts w:ascii="B Nazanin" w:hAnsi="B Nazanin" w:cs="B Nazanin" w:eastAsia="B Nazanin"/>
           <w:rtl/>
         </w:rPr>
         <w:t xml:space="preserve">بیمه آتش‌سوزی و سرقت انبار به ارزش جایگزینی موجودی</w:t>
@@ -2791,6 +3371,7 @@
       </w:pPr>
       <w:r>
         <w:rPr>
+          <w:rFonts w:ascii="B Nazanin" w:hAnsi="B Nazanin" w:cs="B Nazanin" w:eastAsia="B Nazanin"/>
           <w:rtl/>
         </w:rPr>
         <w:t xml:space="preserve">فصل هشتم: نظارت و مقررات نهایی</w:t>
@@ -2802,6 +3383,7 @@
       </w:pPr>
       <w:r>
         <w:rPr>
+          <w:rFonts w:ascii="B Nazanin" w:hAnsi="B Nazanin" w:cs="B Nazanin" w:eastAsia="B Nazanin"/>
           <w:b/>
           <w:bCs/>
           <w:rtl/>
@@ -2810,6 +3392,7 @@
       </w:r>
       <w:r>
         <w:rPr>
+          <w:rFonts w:ascii="B Nazanin" w:hAnsi="B Nazanin" w:cs="B Nazanin" w:eastAsia="B Nazanin"/>
           <w:rtl/>
         </w:rPr>
         <w:t xml:space="preserve"> هر عضو کمیسیون یا کارکنی که خود، بستگان درجه یک یا شرکت‌های وابسته او در معامله نفع دارند، باید کتباً اعلام کند و در بررسی آن شرکت نکند. معامله شرکت با مدیران، شرکا یا اشخاص مرتبط با آنان تنها با تصویب قبلی مجمع عمومی شرکا مجاز است؛ شریک یا مدیر ذینفع در رأی‌گیری آن شرکت نمی‌کند.</w:t>
@@ -2821,6 +3404,7 @@
       </w:pPr>
       <w:r>
         <w:rPr>
+          <w:rFonts w:ascii="B Nazanin" w:hAnsi="B Nazanin" w:cs="B Nazanin" w:eastAsia="B Nazanin"/>
           <w:b/>
           <w:bCs/>
           <w:rtl/>
@@ -2829,6 +3413,7 @@
       </w:r>
       <w:r>
         <w:rPr>
+          <w:rFonts w:ascii="B Nazanin" w:hAnsi="B Nazanin" w:cs="B Nazanin" w:eastAsia="B Nazanin"/>
           <w:rtl/>
         </w:rPr>
         <w:t xml:space="preserve"> پذیرش هر نوع هدیه، پورسانت، سفر رایگان یا امتیاز شخصی از تأمین‌کننده یا مشتری با ارزش بیش از ۱۰۰ میلیون ریال ممنوع است. تخلف موجب برکناری از امور معاملات و پیگرد قانونی است.</w:t>
@@ -2840,6 +3425,7 @@
       </w:pPr>
       <w:r>
         <w:rPr>
+          <w:rFonts w:ascii="B Nazanin" w:hAnsi="B Nazanin" w:cs="B Nazanin" w:eastAsia="B Nazanin"/>
           <w:b/>
           <w:bCs/>
           <w:rtl/>
@@ -2848,6 +3434,7 @@
       </w:r>
       <w:r>
         <w:rPr>
+          <w:rFonts w:ascii="B Nazanin" w:hAnsi="B Nazanin" w:cs="B Nazanin" w:eastAsia="B Nazanin"/>
           <w:rtl/>
         </w:rPr>
         <w:t xml:space="preserve"> حسابرس داخلی هر سه ماه حداقل ۲۰٪ معاملات را به صورت نمونه‌ای (همه معاملات ترک تشریفات) بررسی و گزارش آن را به هیئت‌مدیران ارائه می‌کند.</w:t>
@@ -2859,6 +3446,7 @@
       </w:pPr>
       <w:r>
         <w:rPr>
+          <w:rFonts w:ascii="B Nazanin" w:hAnsi="B Nazanin" w:cs="B Nazanin" w:eastAsia="B Nazanin"/>
           <w:b/>
           <w:bCs/>
           <w:rtl/>
@@ -2867,6 +3455,7 @@
       </w:r>
       <w:r>
         <w:rPr>
+          <w:rFonts w:ascii="B Nazanin" w:hAnsi="B Nazanin" w:cs="B Nazanin" w:eastAsia="B Nazanin"/>
           <w:rtl/>
         </w:rPr>
         <w:t xml:space="preserve"> پرونده هر معامله (استعلام‌ها، صورتجلسه‌ها، قرارداد، اسناد حمل و ترخیص، گواهی‌های بازرسی و اسناد پرداخت) با کد یکتا به صورت کاغذی و الکترونیکی حداقل ۱۰ سال نگهداری می‌شود.</w:t>
@@ -2878,6 +3467,7 @@
       </w:pPr>
       <w:r>
         <w:rPr>
+          <w:rFonts w:ascii="B Nazanin" w:hAnsi="B Nazanin" w:cs="B Nazanin" w:eastAsia="B Nazanin"/>
           <w:b/>
           <w:bCs/>
           <w:rtl/>
@@ -2886,6 +3476,7 @@
       </w:r>
       <w:r>
         <w:rPr>
+          <w:rFonts w:ascii="B Nazanin" w:hAnsi="B Nazanin" w:cs="B Nazanin" w:eastAsia="B Nazanin"/>
           <w:rtl/>
         </w:rPr>
         <w:t xml:space="preserve"> انجام معامله بدون رعایت این آیین‌نامه تخلف است و مسئولیت زیان ناشی از آن با شخص متخلف است.</w:t>
@@ -2897,6 +3488,7 @@
       </w:pPr>
       <w:r>
         <w:rPr>
+          <w:rFonts w:ascii="B Nazanin" w:hAnsi="B Nazanin" w:cs="B Nazanin" w:eastAsia="B Nazanin"/>
           <w:b/>
           <w:bCs/>
           <w:rtl/>
@@ -2905,6 +3497,7 @@
       </w:r>
       <w:r>
         <w:rPr>
+          <w:rFonts w:ascii="B Nazanin" w:hAnsi="B Nazanin" w:cs="B Nazanin" w:eastAsia="B Nazanin"/>
           <w:rtl/>
         </w:rPr>
         <w:t xml:space="preserve"> این آیین‌نامه در ۸ فصل و ۳۳ ماده به تصویب هیئت‌مدیران رسید و از تاریخ تصویب اجرایی است. هر اصلاح فقط با تصویب هیئت‌مدیران معتبر است.</w:t>
@@ -2923,6 +3516,7 @@
       </w:pPr>
       <w:r>
         <w:rPr>
+          <w:rFonts w:ascii="B Nazanin" w:hAnsi="B Nazanin" w:cs="B Nazanin" w:eastAsia="B Nazanin"/>
           <w:b/>
           <w:bCs/>
           <w:rtl/>
@@ -2941,6 +3535,7 @@
       </w:pPr>
       <w:r>
         <w:rPr>
+          <w:rFonts w:ascii="B Nazanin" w:hAnsi="B Nazanin" w:cs="B Nazanin" w:eastAsia="B Nazanin"/>
           <w:rtl/>
         </w:rPr>
         <w:t xml:space="preserve">☐ ثبت تاریخ تصویب در صورتجلسه و امضای هیئت‌مدیران</w:t>
@@ -2957,6 +3552,7 @@
       </w:pPr>
       <w:r>
         <w:rPr>
+          <w:rFonts w:ascii="B Nazanin" w:hAnsi="B Nazanin" w:cs="B Nazanin" w:eastAsia="B Nazanin"/>
           <w:rtl/>
         </w:rPr>
         <w:t xml:space="preserve">☐ نصاب‌های ماده ۵ با توجه به مبلغ معمول محموله‌های شرکت</w:t>
@@ -2973,6 +3569,7 @@
       </w:pPr>
       <w:r>
         <w:rPr>
+          <w:rFonts w:ascii="B Nazanin" w:hAnsi="B Nazanin" w:cs="B Nazanin" w:eastAsia="B Nazanin"/>
           <w:rtl/>
         </w:rPr>
         <w:t xml:space="preserve">☐ اسامی اعضای کمیسیون معاملات</w:t>
@@ -2989,6 +3586,7 @@
       </w:pPr>
       <w:r>
         <w:rPr>
+          <w:rFonts w:ascii="B Nazanin" w:hAnsi="B Nazanin" w:cs="B Nazanin" w:eastAsia="B Nazanin"/>
           <w:rtl/>
         </w:rPr>
         <w:t xml:space="preserve">☐ ابلاغ آیین‌نامه به کارکنان واحدهای بازرگانی، مالی و انبار</w:t>
@@ -3005,17 +3603,134 @@
       </w:pPr>
       <w:r>
         <w:rPr>
+          <w:rFonts w:ascii="B Nazanin" w:hAnsi="B Nazanin" w:cs="B Nazanin" w:eastAsia="B Nazanin"/>
           <w:rtl/>
         </w:rPr>
         <w:t xml:space="preserve">☐ بررسی نهایی توسط مشاور حقوقی و تطبیق با اساسنامه و مقررات روز واردات</w:t>
       </w:r>
     </w:p>
     <w:sectPr>
+      <w:headerReference w:type="default" r:id="rId3"/>
+      <w:footerReference w:type="default" r:id="rId4"/>
       <w:pgSz w:w="12240" w:h="15840"/>
-      <w:pgMar w:top="1440" w:right="1440" w:bottom="1440" w:left="1440" w:header="720" w:footer="720" w:gutter="0"/>
+      <w:pgMar w:top="1417" w:right="1247" w:bottom="1134" w:left="1247" w:header="720" w:footer="720" w:gutter="0"/>
     </w:sectPr>
   </w:body>
 </w:document>
+</file>
+
+<file path=word/footer1.xml><?xml version="1.0" encoding="utf-8"?>
+<w:ftr xmlns:m="http://schemas.openxmlformats.org/officeDocument/2006/math" xmlns:mc="http://schemas.openxmlformats.org/markup-compatibility/2006" xmlns:mo="http://schemas.microsoft.com/office/mac/office/2008/main" xmlns:mv="urn:schemas-microsoft-com:mac:vml" xmlns:o="urn:schemas-microsoft-com:office:office" xmlns:r="http://schemas.openxmlformats.org/officeDocument/2006/relationships" xmlns:v="urn:schemas-microsoft-com:vml" xmlns:w10="urn:schemas-microsoft-com:office:word" xmlns:w14="http://schemas.microsoft.com/office/word/2010/wordml" xmlns:w="http://schemas.openxmlformats.org/wordprocessingml/2006/main" xmlns:wne="http://schemas.microsoft.com/office/word/2006/wordml" xmlns:wp14="http://schemas.microsoft.com/office/word/2010/wordprocessingDrawing" xmlns:wp="http://schemas.openxmlformats.org/drawingml/2006/wordprocessingDrawing" xmlns:wpc="http://schemas.microsoft.com/office/word/2010/wordprocessingCanvas" xmlns:wpg="http://schemas.microsoft.com/office/word/2010/wordprocessingGroup" xmlns:wpi="http://schemas.microsoft.com/office/word/2010/wordprocessingInk" xmlns:wps="http://schemas.microsoft.com/office/word/2010/wordprocessingShape" mc:Ignorable="w14 wp14">
+  <w:p>
+    <w:pPr>
+      <w:pStyle w:val="Footer"/>
+      <w:jc w:val="center"/>
+    </w:pPr>
+    <w:r>
+      <w:rPr>
+        <w:rFonts w:ascii="B Nazanin" w:hAnsi="B Nazanin" w:cs="B Nazanin" w:eastAsia="B Nazanin"/>
+        <w:sz w:val="20"/>
+        <w:szCs w:val="20"/>
+        <w:color w:val="777777"/>
+      </w:rPr>
+      <w:fldChar w:fldCharType="begin"/>
+      <w:instrText xml:space="preserve"> PAGE </w:instrText>
+      <w:fldChar w:fldCharType="end"/>
+    </w:r>
+  </w:p>
+</w:ftr>
+</file>
+
+<file path=word/header1.xml><?xml version="1.0" encoding="utf-8"?>
+<w:hdr xmlns:m="http://schemas.openxmlformats.org/officeDocument/2006/math" xmlns:mc="http://schemas.openxmlformats.org/markup-compatibility/2006" xmlns:mo="http://schemas.microsoft.com/office/mac/office/2008/main" xmlns:mv="urn:schemas-microsoft-com:mac:vml" xmlns:o="urn:schemas-microsoft-com:office:office" xmlns:r="http://schemas.openxmlformats.org/officeDocument/2006/relationships" xmlns:v="urn:schemas-microsoft-com:vml" xmlns:w10="urn:schemas-microsoft-com:office:word" xmlns:w14="http://schemas.microsoft.com/office/word/2010/wordml" xmlns:w="http://schemas.openxmlformats.org/wordprocessingml/2006/main" xmlns:wne="http://schemas.microsoft.com/office/word/2006/wordml" xmlns:wp14="http://schemas.microsoft.com/office/word/2010/wordprocessingDrawing" xmlns:wp="http://schemas.openxmlformats.org/drawingml/2006/wordprocessingDrawing" xmlns:wpc="http://schemas.microsoft.com/office/word/2010/wordprocessingCanvas" xmlns:wpg="http://schemas.microsoft.com/office/word/2010/wordprocessingGroup" xmlns:wpi="http://schemas.microsoft.com/office/word/2010/wordprocessingInk" xmlns:wps="http://schemas.microsoft.com/office/word/2010/wordprocessingShape" mc:Ignorable="w14 wp14">
+  <w:tbl>
+    <w:tblPr>
+      <w:tblW w:type="auto" w:w="0"/>
+      <w:jc w:val="center"/>
+      <w:tblLook w:firstColumn="1" w:firstRow="1" w:lastColumn="0" w:lastRow="0" w:noHBand="0" w:noVBand="1" w:val="04A0"/>
+      <w:bidiVisual/>
+    </w:tblPr>
+    <w:tblGrid>
+      <w:gridCol w:w="4706"/>
+      <w:gridCol w:w="4706"/>
+    </w:tblGrid>
+    <w:tr>
+      <w:tc>
+        <w:tcPr>
+          <w:tcW w:type="dxa" w:w="7143"/>
+        </w:tcPr>
+        <w:p>
+          <w:pPr>
+            <w:spacing w:after="0"/>
+          </w:pPr>
+          <w:r>
+            <w:rPr>
+              <w:rFonts w:ascii="B Nazanin" w:hAnsi="B Nazanin" w:cs="B Nazanin" w:eastAsia="B Nazanin"/>
+              <w:rtl/>
+              <w:sz w:val="28"/>
+              <w:szCs w:val="28"/>
+              <w:b/>
+              <w:color w:val="1F5132"/>
+            </w:rPr>
+            <w:t>شرکت بردیا تجارت ماندگار</w:t>
+          </w:r>
+        </w:p>
+        <w:p>
+          <w:pPr>
+            <w:spacing w:after="0"/>
+          </w:pPr>
+          <w:r>
+            <w:rPr>
+              <w:rFonts w:ascii="B Nazanin" w:hAnsi="B Nazanin" w:cs="B Nazanin" w:eastAsia="B Nazanin"/>
+              <w:rtl/>
+              <w:sz w:val="20"/>
+              <w:szCs w:val="20"/>
+              <w:b w:val="0"/>
+              <w:color w:val="777777"/>
+            </w:rPr>
+            <w:t>آیین‌نامه معاملات</w:t>
+          </w:r>
+        </w:p>
+      </w:tc>
+      <w:tc>
+        <w:tcPr>
+          <w:tcW w:type="dxa" w:w="2268"/>
+          <w:tcBorders>
+            <w:top w:val="dashed" w:sz="4" w:space="0" w:color="BBBBBB"/>
+            <w:left w:val="dashed" w:sz="4" w:space="0" w:color="BBBBBB"/>
+            <w:bottom w:val="dashed" w:sz="4" w:space="0" w:color="BBBBBB"/>
+            <w:right w:val="dashed" w:sz="4" w:space="0" w:color="BBBBBB"/>
+          </w:tcBorders>
+          <w:vAlign w:val="center"/>
+        </w:tcPr>
+        <w:p>
+          <w:pPr>
+            <w:jc w:val="center"/>
+          </w:pPr>
+          <w:r>
+            <w:rPr>
+              <w:rFonts w:ascii="B Nazanin" w:hAnsi="B Nazanin" w:cs="B Nazanin" w:eastAsia="B Nazanin"/>
+              <w:rtl/>
+              <w:sz w:val="20"/>
+              <w:szCs w:val="20"/>
+              <w:b w:val="0"/>
+              <w:color w:val="999999"/>
+            </w:rPr>
+            <w:t>[ جای لوگو ]</w:t>
+          </w:r>
+        </w:p>
+      </w:tc>
+    </w:tr>
+  </w:tbl>
+  <w:p>
+    <w:pPr>
+      <w:pStyle w:val="Header"/>
+      <w:pBdr>
+        <w:bottom w:val="single" w:sz="8" w:space="1" w:color="B8860B"/>
+      </w:pBdr>
+    </w:pPr>
+  </w:p>
+</w:hdr>
 </file>
 
 <file path=word/numbering.xml><?xml version="1.0" encoding="utf-8"?>
@@ -3247,10 +3962,10 @@
   <w:docDefaults>
     <w:rPrDefault>
       <w:rPr>
-        <w:rFonts w:ascii="Tahoma" w:hAnsi="Tahoma" w:eastAsia="Tahoma" w:cs="Tahoma"/>
+        <w:rFonts w:ascii="B Nazanin" w:hAnsi="B Nazanin" w:eastAsia="B Nazanin" w:cs="B Nazanin"/>
         <w:sz w:val="22"/>
         <w:szCs w:val="22"/>
-        <w:lang w:val="en-US" w:bidi="fa-IR"/>
+        <w:lang w:val="en-US"/>
       </w:rPr>
     </w:rPrDefault>
     <w:pPrDefault>
@@ -3262,6 +3977,15 @@
   <w:style w:type="paragraph" w:default="1" w:styleId="Normal">
     <w:name w:val="Normal"/>
     <w:qFormat/>
+    <w:pPr>
+      <w:spacing w:line="300" w:lineRule="auto" w:after="120"/>
+    </w:pPr>
+    <w:rPr>
+      <w:rFonts w:ascii="B Nazanin" w:hAnsi="B Nazanin" w:cs="B Nazanin" w:eastAsia="B Nazanin"/>
+      <w:sz w:val="26"/>
+      <w:szCs w:val="26"/>
+      <w:lang w:bidi="fa-IR"/>
+    </w:rPr>
   </w:style>
   <w:style w:type="paragraph" w:styleId="Heading1">
     <w:name w:val="heading 1"/>
@@ -3274,10 +3998,12 @@
       <w:outlineLvl w:val="0"/>
     </w:pPr>
     <w:rPr>
+      <w:rFonts w:ascii="B Nazanin" w:hAnsi="B Nazanin" w:cs="B Nazanin" w:eastAsia="B Nazanin"/>
       <w:b/>
       <w:bCs/>
-      <w:sz w:val="32"/>
-      <w:szCs w:val="32"/>
+      <w:sz w:val="44"/>
+      <w:szCs w:val="44"/>
+      <w:color w:val="1F5132"/>
     </w:rPr>
   </w:style>
   <w:style w:type="paragraph" w:styleId="Heading2">
@@ -3287,14 +4013,19 @@
     <w:qFormat/>
     <w:pPr>
       <w:keepNext/>
-      <w:spacing w:before="280" w:after="100"/>
+      <w:spacing w:before="360" w:after="100"/>
       <w:outlineLvl w:val="1"/>
+      <w:pBdr>
+        <w:bottom w:val="single" w:sz="8" w:space="4" w:color="B8860B"/>
+      </w:pBdr>
     </w:pPr>
     <w:rPr>
+      <w:rFonts w:ascii="B Nazanin" w:hAnsi="B Nazanin" w:cs="B Nazanin" w:eastAsia="B Nazanin"/>
       <w:b/>
       <w:bCs/>
-      <w:sz w:val="26"/>
-      <w:szCs w:val="26"/>
+      <w:sz w:val="32"/>
+      <w:szCs w:val="32"/>
+      <w:color w:val="2E7D4F"/>
     </w:rPr>
   </w:style>
   <w:style w:type="paragraph" w:styleId="Heading3">

</xml_diff>

<commit_message>
Add company logo to transactions regulation header and title page
Co-Authored-By: Claude Opus 5.5 <noreply@anthropic.com>
Claude-Session: https://claude.ai/code/session_01P5njy2pndSsBFLMsP1j6Uw
</commit_message>
<xml_diff>
--- a/آیین‌نامه معاملات بردیا تجارت ماندگار.docx
+++ b/آیین‌نامه معاملات بردیا تجارت ماندگار.docx
@@ -2,6 +2,45 @@
 <file path=word/document.xml><?xml version="1.0" encoding="utf-8"?>
 <w:document xmlns:w="http://schemas.openxmlformats.org/wordprocessingml/2006/main" xmlns:r="http://schemas.openxmlformats.org/officeDocument/2006/relationships" xmlns:wp="http://schemas.openxmlformats.org/drawingml/2006/wordprocessingDrawing" xmlns:a="http://schemas.openxmlformats.org/drawingml/2006/main" xmlns:pic="http://schemas.openxmlformats.org/drawingml/2006/picture">
   <w:body>
+    <w:p>
+      <w:pPr>
+        <w:jc w:val="center"/>
+      </w:pPr>
+      <w:r>
+        <w:drawing>
+          <wp:inline>
+            <wp:extent cx="1377638" cy="1296000"/>
+            <wp:docPr id="1" name="Picture 1"/>
+            <wp:cNvGraphicFramePr>
+              <a:graphicFrameLocks noChangeAspect="1"/>
+            </wp:cNvGraphicFramePr>
+            <a:graphic>
+              <a:graphicData uri="http://schemas.openxmlformats.org/drawingml/2006/picture">
+                <pic:pic>
+                  <pic:nvPicPr>
+                    <pic:cNvPr id="0" name="logo.png"/>
+                    <pic:cNvPicPr/>
+                  </pic:nvPicPr>
+                  <pic:blipFill>
+                    <a:blip r:embed="rId3"/>
+                    <a:stretch>
+                      <a:fillRect/>
+                    </a:stretch>
+                  </pic:blipFill>
+                  <pic:spPr>
+                    <a:xfrm>
+                      <a:off x="0" y="0"/>
+                      <a:ext cx="1377638" cy="1296000"/>
+                    </a:xfrm>
+                    <a:prstGeom prst="rect"/>
+                  </pic:spPr>
+                </pic:pic>
+              </a:graphicData>
+            </a:graphic>
+          </wp:inline>
+        </w:drawing>
+      </w:r>
+    </w:p>
     <w:p>
       <w:pPr>
         <w:pStyle w:val="Heading1"/>
@@ -3610,8 +3649,8 @@
       </w:r>
     </w:p>
     <w:sectPr>
-      <w:headerReference w:type="default" r:id="rId3"/>
-      <w:footerReference w:type="default" r:id="rId4"/>
+      <w:headerReference w:type="default" r:id="rId4"/>
+      <w:footerReference w:type="default" r:id="rId5"/>
       <w:pgSz w:w="12240" w:h="15840"/>
       <w:pgMar w:top="1417" w:right="1247" w:bottom="1134" w:left="1247" w:header="720" w:footer="720" w:gutter="0"/>
     </w:sectPr>
@@ -3695,12 +3734,6 @@
       <w:tc>
         <w:tcPr>
           <w:tcW w:type="dxa" w:w="2268"/>
-          <w:tcBorders>
-            <w:top w:val="dashed" w:sz="4" w:space="0" w:color="BBBBBB"/>
-            <w:left w:val="dashed" w:sz="4" w:space="0" w:color="BBBBBB"/>
-            <w:bottom w:val="dashed" w:sz="4" w:space="0" w:color="BBBBBB"/>
-            <w:right w:val="dashed" w:sz="4" w:space="0" w:color="BBBBBB"/>
-          </w:tcBorders>
           <w:vAlign w:val="center"/>
         </w:tcPr>
         <w:p>
@@ -3708,15 +3741,38 @@
             <w:jc w:val="center"/>
           </w:pPr>
           <w:r>
-            <w:rPr>
-              <w:rFonts w:ascii="B Nazanin" w:hAnsi="B Nazanin" w:cs="B Nazanin" w:eastAsia="B Nazanin"/>
-              <w:rtl/>
-              <w:sz w:val="20"/>
-              <w:szCs w:val="20"/>
-              <w:b w:val="0"/>
-              <w:color w:val="999999"/>
-            </w:rPr>
-            <w:t>[ جای لوگو ]</w:t>
+            <w:drawing>
+              <wp:inline xmlns:a="http://schemas.openxmlformats.org/drawingml/2006/main" xmlns:pic="http://schemas.openxmlformats.org/drawingml/2006/picture">
+                <wp:extent cx="535747" cy="503999"/>
+                <wp:docPr id="1" name="Picture 1"/>
+                <wp:cNvGraphicFramePr>
+                  <a:graphicFrameLocks noChangeAspect="1"/>
+                </wp:cNvGraphicFramePr>
+                <a:graphic>
+                  <a:graphicData uri="http://schemas.openxmlformats.org/drawingml/2006/picture">
+                    <pic:pic>
+                      <pic:nvPicPr>
+                        <pic:cNvPr id="0" name="logo.png"/>
+                        <pic:cNvPicPr/>
+                      </pic:nvPicPr>
+                      <pic:blipFill>
+                        <a:blip r:embed="rId1"/>
+                        <a:stretch>
+                          <a:fillRect/>
+                        </a:stretch>
+                      </pic:blipFill>
+                      <pic:spPr>
+                        <a:xfrm>
+                          <a:off x="0" y="0"/>
+                          <a:ext cx="535747" cy="503999"/>
+                        </a:xfrm>
+                        <a:prstGeom prst="rect"/>
+                      </pic:spPr>
+                    </pic:pic>
+                  </a:graphicData>
+                </a:graphic>
+              </wp:inline>
+            </w:drawing>
           </w:r>
         </w:p>
       </w:tc>

</xml_diff>